<commit_message>
Round 20ae: refresh the work log and package for the tidy-up round
The work log lists every round commit, so this round's own commit belongs in it (63 round entries now); the submission package and the published manifest are rebuilt so the archive ships the current log.
</commit_message>
<xml_diff>
--- a/重构版论文_v4_20260915/工作日志_论文项目.docx
+++ b/重构版论文_v4_20260915/工作日志_论文项目.docx
@@ -19,7 +19,7 @@
         <w:t>生成时间</w:t>
       </w:r>
       <w:r>
-        <w:t xml:space="preserve">：2026-09-26 23:30（由 </w:t>
+        <w:t xml:space="preserve">：2026-09-26 23:44（由 </w:t>
       </w:r>
       <w:r>
         <w:rPr>
@@ -692,7 +692,7 @@
         <w:pStyle w:val="Heading2"/>
       </w:pPr>
       <w:r>
-        <w:t>2.2 仓库提交中的逐轮记录（62 条）</w:t>
+        <w:t>2.2 仓库提交中的逐轮记录（63 条）</w:t>
       </w:r>
     </w:p>
     <w:tbl>
@@ -6195,6 +6195,93 @@
                 <w:sz w:val="16"/>
               </w:rPr>
               <w:t>the work log ships as Word, with the per-round operating procedure</w:t>
+            </w:r>
+          </w:p>
+        </w:tc>
+      </w:tr>
+      <w:tr>
+        <w:tc>
+          <w:tcPr>
+            <w:tcW w:type="dxa" w:w="2448"/>
+          </w:tcPr>
+          <w:p>
+            <w:pPr>
+              <w:spacing w:after="0"/>
+            </w:pPr>
+            <w:r>
+              <w:rPr>
+                <w:sz w:val="16"/>
+              </w:rPr>
+            </w:r>
+            <w:r>
+              <w:rPr>
+                <w:sz w:val="16"/>
+              </w:rPr>
+              <w:t>Round 20ae</w:t>
+            </w:r>
+          </w:p>
+        </w:tc>
+        <w:tc>
+          <w:tcPr>
+            <w:tcW w:type="dxa" w:w="2448"/>
+          </w:tcPr>
+          <w:p>
+            <w:pPr>
+              <w:spacing w:after="0"/>
+            </w:pPr>
+            <w:r>
+              <w:rPr>
+                <w:sz w:val="16"/>
+              </w:rPr>
+            </w:r>
+            <w:r>
+              <w:rPr>
+                <w:rFonts w:ascii="Consolas" w:hAnsi="Consolas"/>
+                <w:sz w:val="16"/>
+              </w:rPr>
+              <w:t>d6f90d4</w:t>
+            </w:r>
+          </w:p>
+        </w:tc>
+        <w:tc>
+          <w:tcPr>
+            <w:tcW w:type="dxa" w:w="2448"/>
+          </w:tcPr>
+          <w:p>
+            <w:pPr>
+              <w:spacing w:after="0"/>
+            </w:pPr>
+            <w:r>
+              <w:rPr>
+                <w:sz w:val="16"/>
+              </w:rPr>
+            </w:r>
+            <w:r>
+              <w:rPr>
+                <w:sz w:val="16"/>
+              </w:rPr>
+              <w:t>2026-09-26</w:t>
+            </w:r>
+          </w:p>
+        </w:tc>
+        <w:tc>
+          <w:tcPr>
+            <w:tcW w:type="dxa" w:w="2448"/>
+          </w:tcPr>
+          <w:p>
+            <w:pPr>
+              <w:spacing w:after="0"/>
+            </w:pPr>
+            <w:r>
+              <w:rPr>
+                <w:sz w:val="16"/>
+              </w:rPr>
+            </w:r>
+            <w:r>
+              <w:rPr>
+                <w:sz w:val="16"/>
+              </w:rPr>
+              <w:t>second tidy-up pass — 31 leftover files moved out of the release tree</w:t>
             </w:r>
           </w:p>
         </w:tc>

</xml_diff>

<commit_message>
Round 20af: refresh the work log and package for the introduction round
The work log lists every round commit and the package registers the new 10_论文介绍 folder, so both are regenerated after the introduction landed; the archive now holds 140 files.
</commit_message>
<xml_diff>
--- a/重构版论文_v4_20260915/工作日志_论文项目.docx
+++ b/重构版论文_v4_20260915/工作日志_论文项目.docx
@@ -19,7 +19,7 @@
         <w:t>生成时间</w:t>
       </w:r>
       <w:r>
-        <w:t xml:space="preserve">：2026-09-26 23:44（由 </w:t>
+        <w:t xml:space="preserve">：2026-09-27 15:15（由 </w:t>
       </w:r>
       <w:r>
         <w:rPr>
@@ -492,7 +492,7 @@
               <w:rPr>
                 <w:sz w:val="16"/>
               </w:rPr>
-              <w:t>，140 个条目</w:t>
+              <w:t>，142 个条目</w:t>
             </w:r>
           </w:p>
         </w:tc>
@@ -692,7 +692,7 @@
         <w:pStyle w:val="Heading2"/>
       </w:pPr>
       <w:r>
-        <w:t>2.2 仓库提交中的逐轮记录（63 条）</w:t>
+        <w:t>2.2 仓库提交中的逐轮记录（65 条）</w:t>
       </w:r>
     </w:p>
     <w:tbl>
@@ -6282,6 +6282,180 @@
                 <w:sz w:val="16"/>
               </w:rPr>
               <w:t>second tidy-up pass — 31 leftover files moved out of the release tree</w:t>
+            </w:r>
+          </w:p>
+        </w:tc>
+      </w:tr>
+      <w:tr>
+        <w:tc>
+          <w:tcPr>
+            <w:tcW w:type="dxa" w:w="2448"/>
+          </w:tcPr>
+          <w:p>
+            <w:pPr>
+              <w:spacing w:after="0"/>
+            </w:pPr>
+            <w:r>
+              <w:rPr>
+                <w:sz w:val="16"/>
+              </w:rPr>
+            </w:r>
+            <w:r>
+              <w:rPr>
+                <w:sz w:val="16"/>
+              </w:rPr>
+              <w:t>Round 20ae</w:t>
+            </w:r>
+          </w:p>
+        </w:tc>
+        <w:tc>
+          <w:tcPr>
+            <w:tcW w:type="dxa" w:w="2448"/>
+          </w:tcPr>
+          <w:p>
+            <w:pPr>
+              <w:spacing w:after="0"/>
+            </w:pPr>
+            <w:r>
+              <w:rPr>
+                <w:sz w:val="16"/>
+              </w:rPr>
+            </w:r>
+            <w:r>
+              <w:rPr>
+                <w:rFonts w:ascii="Consolas" w:hAnsi="Consolas"/>
+                <w:sz w:val="16"/>
+              </w:rPr>
+              <w:t>b61bc85</w:t>
+            </w:r>
+          </w:p>
+        </w:tc>
+        <w:tc>
+          <w:tcPr>
+            <w:tcW w:type="dxa" w:w="2448"/>
+          </w:tcPr>
+          <w:p>
+            <w:pPr>
+              <w:spacing w:after="0"/>
+            </w:pPr>
+            <w:r>
+              <w:rPr>
+                <w:sz w:val="16"/>
+              </w:rPr>
+            </w:r>
+            <w:r>
+              <w:rPr>
+                <w:sz w:val="16"/>
+              </w:rPr>
+              <w:t>2026-09-26</w:t>
+            </w:r>
+          </w:p>
+        </w:tc>
+        <w:tc>
+          <w:tcPr>
+            <w:tcW w:type="dxa" w:w="2448"/>
+          </w:tcPr>
+          <w:p>
+            <w:pPr>
+              <w:spacing w:after="0"/>
+            </w:pPr>
+            <w:r>
+              <w:rPr>
+                <w:sz w:val="16"/>
+              </w:rPr>
+            </w:r>
+            <w:r>
+              <w:rPr>
+                <w:sz w:val="16"/>
+              </w:rPr>
+              <w:t>refresh the work log and package for the tidy-up round</w:t>
+            </w:r>
+          </w:p>
+        </w:tc>
+      </w:tr>
+      <w:tr>
+        <w:tc>
+          <w:tcPr>
+            <w:tcW w:type="dxa" w:w="2448"/>
+          </w:tcPr>
+          <w:p>
+            <w:pPr>
+              <w:spacing w:after="0"/>
+            </w:pPr>
+            <w:r>
+              <w:rPr>
+                <w:sz w:val="16"/>
+              </w:rPr>
+            </w:r>
+            <w:r>
+              <w:rPr>
+                <w:sz w:val="16"/>
+              </w:rPr>
+              <w:t>Round 20af</w:t>
+            </w:r>
+          </w:p>
+        </w:tc>
+        <w:tc>
+          <w:tcPr>
+            <w:tcW w:type="dxa" w:w="2448"/>
+          </w:tcPr>
+          <w:p>
+            <w:pPr>
+              <w:spacing w:after="0"/>
+            </w:pPr>
+            <w:r>
+              <w:rPr>
+                <w:sz w:val="16"/>
+              </w:rPr>
+            </w:r>
+            <w:r>
+              <w:rPr>
+                <w:rFonts w:ascii="Consolas" w:hAnsi="Consolas"/>
+                <w:sz w:val="16"/>
+              </w:rPr>
+              <w:t>39ea3ef</w:t>
+            </w:r>
+          </w:p>
+        </w:tc>
+        <w:tc>
+          <w:tcPr>
+            <w:tcW w:type="dxa" w:w="2448"/>
+          </w:tcPr>
+          <w:p>
+            <w:pPr>
+              <w:spacing w:after="0"/>
+            </w:pPr>
+            <w:r>
+              <w:rPr>
+                <w:sz w:val="16"/>
+              </w:rPr>
+            </w:r>
+            <w:r>
+              <w:rPr>
+                <w:sz w:val="16"/>
+              </w:rPr>
+              <w:t>2026-09-27</w:t>
+            </w:r>
+          </w:p>
+        </w:tc>
+        <w:tc>
+          <w:tcPr>
+            <w:tcW w:type="dxa" w:w="2448"/>
+          </w:tcPr>
+          <w:p>
+            <w:pPr>
+              <w:spacing w:after="0"/>
+            </w:pPr>
+            <w:r>
+              <w:rPr>
+                <w:sz w:val="16"/>
+              </w:rPr>
+            </w:r>
+            <w:r>
+              <w:rPr>
+                <w:sz w:val="16"/>
+              </w:rPr>
+              <w:t>standalone paper introduction, in Markdown and Word</w:t>
             </w:r>
           </w:p>
         </w:tc>

</xml_diff>

<commit_message>
Round 20ag: refresh the work log and package for the per-class round
The work log lists every round commit and the package ships the current log and manifest, so both follow the per-class audit; the archive stays at 140 files.
</commit_message>
<xml_diff>
--- a/重构版论文_v4_20260915/工作日志_论文项目.docx
+++ b/重构版论文_v4_20260915/工作日志_论文项目.docx
@@ -19,7 +19,7 @@
         <w:t>生成时间</w:t>
       </w:r>
       <w:r>
-        <w:t xml:space="preserve">：2026-09-27 15:15（由 </w:t>
+        <w:t xml:space="preserve">：2026-09-27 15:53（由 </w:t>
       </w:r>
       <w:r>
         <w:rPr>
@@ -252,7 +252,7 @@
               <w:rPr>
                 <w:sz w:val="16"/>
               </w:rPr>
-              <w:t>45 项检查全绿（</w:t>
+              <w:t>46 项检查全绿（</w:t>
             </w:r>
             <w:r>
               <w:rPr>
@@ -692,7 +692,7 @@
         <w:pStyle w:val="Heading2"/>
       </w:pPr>
       <w:r>
-        <w:t>2.2 仓库提交中的逐轮记录（65 条）</w:t>
+        <w:t>2.2 仓库提交中的逐轮记录（67 条）</w:t>
       </w:r>
     </w:p>
     <w:tbl>
@@ -6456,6 +6456,180 @@
                 <w:sz w:val="16"/>
               </w:rPr>
               <w:t>standalone paper introduction, in Markdown and Word</w:t>
+            </w:r>
+          </w:p>
+        </w:tc>
+      </w:tr>
+      <w:tr>
+        <w:tc>
+          <w:tcPr>
+            <w:tcW w:type="dxa" w:w="2448"/>
+          </w:tcPr>
+          <w:p>
+            <w:pPr>
+              <w:spacing w:after="0"/>
+            </w:pPr>
+            <w:r>
+              <w:rPr>
+                <w:sz w:val="16"/>
+              </w:rPr>
+            </w:r>
+            <w:r>
+              <w:rPr>
+                <w:sz w:val="16"/>
+              </w:rPr>
+              <w:t>Round 20af</w:t>
+            </w:r>
+          </w:p>
+        </w:tc>
+        <w:tc>
+          <w:tcPr>
+            <w:tcW w:type="dxa" w:w="2448"/>
+          </w:tcPr>
+          <w:p>
+            <w:pPr>
+              <w:spacing w:after="0"/>
+            </w:pPr>
+            <w:r>
+              <w:rPr>
+                <w:sz w:val="16"/>
+              </w:rPr>
+            </w:r>
+            <w:r>
+              <w:rPr>
+                <w:rFonts w:ascii="Consolas" w:hAnsi="Consolas"/>
+                <w:sz w:val="16"/>
+              </w:rPr>
+              <w:t>6185786</w:t>
+            </w:r>
+          </w:p>
+        </w:tc>
+        <w:tc>
+          <w:tcPr>
+            <w:tcW w:type="dxa" w:w="2448"/>
+          </w:tcPr>
+          <w:p>
+            <w:pPr>
+              <w:spacing w:after="0"/>
+            </w:pPr>
+            <w:r>
+              <w:rPr>
+                <w:sz w:val="16"/>
+              </w:rPr>
+            </w:r>
+            <w:r>
+              <w:rPr>
+                <w:sz w:val="16"/>
+              </w:rPr>
+              <w:t>2026-09-27</w:t>
+            </w:r>
+          </w:p>
+        </w:tc>
+        <w:tc>
+          <w:tcPr>
+            <w:tcW w:type="dxa" w:w="2448"/>
+          </w:tcPr>
+          <w:p>
+            <w:pPr>
+              <w:spacing w:after="0"/>
+            </w:pPr>
+            <w:r>
+              <w:rPr>
+                <w:sz w:val="16"/>
+              </w:rPr>
+            </w:r>
+            <w:r>
+              <w:rPr>
+                <w:sz w:val="16"/>
+              </w:rPr>
+              <w:t>refresh the work log and package for the introduction round</w:t>
+            </w:r>
+          </w:p>
+        </w:tc>
+      </w:tr>
+      <w:tr>
+        <w:tc>
+          <w:tcPr>
+            <w:tcW w:type="dxa" w:w="2448"/>
+          </w:tcPr>
+          <w:p>
+            <w:pPr>
+              <w:spacing w:after="0"/>
+            </w:pPr>
+            <w:r>
+              <w:rPr>
+                <w:sz w:val="16"/>
+              </w:rPr>
+            </w:r>
+            <w:r>
+              <w:rPr>
+                <w:sz w:val="16"/>
+              </w:rPr>
+              <w:t>Round 20ag</w:t>
+            </w:r>
+          </w:p>
+        </w:tc>
+        <w:tc>
+          <w:tcPr>
+            <w:tcW w:type="dxa" w:w="2448"/>
+          </w:tcPr>
+          <w:p>
+            <w:pPr>
+              <w:spacing w:after="0"/>
+            </w:pPr>
+            <w:r>
+              <w:rPr>
+                <w:sz w:val="16"/>
+              </w:rPr>
+            </w:r>
+            <w:r>
+              <w:rPr>
+                <w:rFonts w:ascii="Consolas" w:hAnsi="Consolas"/>
+                <w:sz w:val="16"/>
+              </w:rPr>
+              <w:t>af3eaa9</w:t>
+            </w:r>
+          </w:p>
+        </w:tc>
+        <w:tc>
+          <w:tcPr>
+            <w:tcW w:type="dxa" w:w="2448"/>
+          </w:tcPr>
+          <w:p>
+            <w:pPr>
+              <w:spacing w:after="0"/>
+            </w:pPr>
+            <w:r>
+              <w:rPr>
+                <w:sz w:val="16"/>
+              </w:rPr>
+            </w:r>
+            <w:r>
+              <w:rPr>
+                <w:sz w:val="16"/>
+              </w:rPr>
+              <w:t>2026-09-27</w:t>
+            </w:r>
+          </w:p>
+        </w:tc>
+        <w:tc>
+          <w:tcPr>
+            <w:tcW w:type="dxa" w:w="2448"/>
+          </w:tcPr>
+          <w:p>
+            <w:pPr>
+              <w:spacing w:after="0"/>
+            </w:pPr>
+            <w:r>
+              <w:rPr>
+                <w:sz w:val="16"/>
+              </w:rPr>
+            </w:r>
+            <w:r>
+              <w:rPr>
+                <w:sz w:val="16"/>
+              </w:rPr>
+              <w:t>per-class data accuracy — 270 values recomputed from the predictions</w:t>
             </w:r>
           </w:p>
         </w:tc>
@@ -6604,6 +6778,18 @@
       </w:pPr>
       <w:r>
         <w:t>released evidence</w:t>
+      </w:r>
+    </w:p>
+    <w:p>
+      <w:pPr>
+        <w:pStyle w:val="ListNumber"/>
+        <w:numPr>
+          <w:ilvl w:val="0"/>
+          <w:numId w:val="10"/>
+        </w:numPr>
+      </w:pPr>
+      <w:r>
+        <w:t>per-class metrics</w:t>
       </w:r>
     </w:p>
     <w:p>

</xml_diff>

<commit_message>
Round 20ah: refresh the work log and package for the briefing round
The work log lists every round commit and the package ships the current log, manifest and briefing material; the archive holds 142 files.
</commit_message>
<xml_diff>
--- a/重构版论文_v4_20260915/工作日志_论文项目.docx
+++ b/重构版论文_v4_20260915/工作日志_论文项目.docx
@@ -19,7 +19,7 @@
         <w:t>生成时间</w:t>
       </w:r>
       <w:r>
-        <w:t xml:space="preserve">：2026-09-27 15:53（由 </w:t>
+        <w:t xml:space="preserve">：2026-09-27 16:04（由 </w:t>
       </w:r>
       <w:r>
         <w:rPr>
@@ -492,7 +492,7 @@
               <w:rPr>
                 <w:sz w:val="16"/>
               </w:rPr>
-              <w:t>，142 个条目</w:t>
+              <w:t>，144 个条目</w:t>
             </w:r>
           </w:p>
         </w:tc>
@@ -692,7 +692,7 @@
         <w:pStyle w:val="Heading2"/>
       </w:pPr>
       <w:r>
-        <w:t>2.2 仓库提交中的逐轮记录（67 条）</w:t>
+        <w:t>2.2 仓库提交中的逐轮记录（69 条）</w:t>
       </w:r>
     </w:p>
     <w:tbl>
@@ -6630,6 +6630,180 @@
                 <w:sz w:val="16"/>
               </w:rPr>
               <w:t>per-class data accuracy — 270 values recomputed from the predictions</w:t>
+            </w:r>
+          </w:p>
+        </w:tc>
+      </w:tr>
+      <w:tr>
+        <w:tc>
+          <w:tcPr>
+            <w:tcW w:type="dxa" w:w="2448"/>
+          </w:tcPr>
+          <w:p>
+            <w:pPr>
+              <w:spacing w:after="0"/>
+            </w:pPr>
+            <w:r>
+              <w:rPr>
+                <w:sz w:val="16"/>
+              </w:rPr>
+            </w:r>
+            <w:r>
+              <w:rPr>
+                <w:sz w:val="16"/>
+              </w:rPr>
+              <w:t>Round 20ag</w:t>
+            </w:r>
+          </w:p>
+        </w:tc>
+        <w:tc>
+          <w:tcPr>
+            <w:tcW w:type="dxa" w:w="2448"/>
+          </w:tcPr>
+          <w:p>
+            <w:pPr>
+              <w:spacing w:after="0"/>
+            </w:pPr>
+            <w:r>
+              <w:rPr>
+                <w:sz w:val="16"/>
+              </w:rPr>
+            </w:r>
+            <w:r>
+              <w:rPr>
+                <w:rFonts w:ascii="Consolas" w:hAnsi="Consolas"/>
+                <w:sz w:val="16"/>
+              </w:rPr>
+              <w:t>1729f48</w:t>
+            </w:r>
+          </w:p>
+        </w:tc>
+        <w:tc>
+          <w:tcPr>
+            <w:tcW w:type="dxa" w:w="2448"/>
+          </w:tcPr>
+          <w:p>
+            <w:pPr>
+              <w:spacing w:after="0"/>
+            </w:pPr>
+            <w:r>
+              <w:rPr>
+                <w:sz w:val="16"/>
+              </w:rPr>
+            </w:r>
+            <w:r>
+              <w:rPr>
+                <w:sz w:val="16"/>
+              </w:rPr>
+              <w:t>2026-09-27</w:t>
+            </w:r>
+          </w:p>
+        </w:tc>
+        <w:tc>
+          <w:tcPr>
+            <w:tcW w:type="dxa" w:w="2448"/>
+          </w:tcPr>
+          <w:p>
+            <w:pPr>
+              <w:spacing w:after="0"/>
+            </w:pPr>
+            <w:r>
+              <w:rPr>
+                <w:sz w:val="16"/>
+              </w:rPr>
+            </w:r>
+            <w:r>
+              <w:rPr>
+                <w:sz w:val="16"/>
+              </w:rPr>
+              <w:t>refresh the work log and package for the per-class round</w:t>
+            </w:r>
+          </w:p>
+        </w:tc>
+      </w:tr>
+      <w:tr>
+        <w:tc>
+          <w:tcPr>
+            <w:tcW w:type="dxa" w:w="2448"/>
+          </w:tcPr>
+          <w:p>
+            <w:pPr>
+              <w:spacing w:after="0"/>
+            </w:pPr>
+            <w:r>
+              <w:rPr>
+                <w:sz w:val="16"/>
+              </w:rPr>
+            </w:r>
+            <w:r>
+              <w:rPr>
+                <w:sz w:val="16"/>
+              </w:rPr>
+              <w:t>Round 20ah</w:t>
+            </w:r>
+          </w:p>
+        </w:tc>
+        <w:tc>
+          <w:tcPr>
+            <w:tcW w:type="dxa" w:w="2448"/>
+          </w:tcPr>
+          <w:p>
+            <w:pPr>
+              <w:spacing w:after="0"/>
+            </w:pPr>
+            <w:r>
+              <w:rPr>
+                <w:sz w:val="16"/>
+              </w:rPr>
+            </w:r>
+            <w:r>
+              <w:rPr>
+                <w:rFonts w:ascii="Consolas" w:hAnsi="Consolas"/>
+                <w:sz w:val="16"/>
+              </w:rPr>
+              <w:t>adc5409</w:t>
+            </w:r>
+          </w:p>
+        </w:tc>
+        <w:tc>
+          <w:tcPr>
+            <w:tcW w:type="dxa" w:w="2448"/>
+          </w:tcPr>
+          <w:p>
+            <w:pPr>
+              <w:spacing w:after="0"/>
+            </w:pPr>
+            <w:r>
+              <w:rPr>
+                <w:sz w:val="16"/>
+              </w:rPr>
+            </w:r>
+            <w:r>
+              <w:rPr>
+                <w:sz w:val="16"/>
+              </w:rPr>
+              <w:t>2026-09-27</w:t>
+            </w:r>
+          </w:p>
+        </w:tc>
+        <w:tc>
+          <w:tcPr>
+            <w:tcW w:type="dxa" w:w="2448"/>
+          </w:tcPr>
+          <w:p>
+            <w:pPr>
+              <w:spacing w:after="0"/>
+            </w:pPr>
+            <w:r>
+              <w:rPr>
+                <w:sz w:val="16"/>
+              </w:rPr>
+            </w:r>
+            <w:r>
+              <w:rPr>
+                <w:sz w:val="16"/>
+              </w:rPr>
+              <w:t>supervisor briefing — talk script in three lengths plus the likely questions</w:t>
             </w:r>
           </w:p>
         </w:tc>

</xml_diff>

<commit_message>
Round 20ai: refresh the work log and package for the deck round
The work log lists every round commit and the package ships the current log, manifest and deck; the archive holds 143 files.
</commit_message>
<xml_diff>
--- a/重构版论文_v4_20260915/工作日志_论文项目.docx
+++ b/重构版论文_v4_20260915/工作日志_论文项目.docx
@@ -19,7 +19,7 @@
         <w:t>生成时间</w:t>
       </w:r>
       <w:r>
-        <w:t xml:space="preserve">：2026-09-27 16:04（由 </w:t>
+        <w:t xml:space="preserve">：2026-09-27 16:18（由 </w:t>
       </w:r>
       <w:r>
         <w:rPr>
@@ -252,7 +252,7 @@
               <w:rPr>
                 <w:sz w:val="16"/>
               </w:rPr>
-              <w:t>46 项检查全绿（</w:t>
+              <w:t>47 项检查全绿（</w:t>
             </w:r>
             <w:r>
               <w:rPr>
@@ -492,7 +492,7 @@
               <w:rPr>
                 <w:sz w:val="16"/>
               </w:rPr>
-              <w:t>，144 个条目</w:t>
+              <w:t>，145 个条目</w:t>
             </w:r>
           </w:p>
         </w:tc>
@@ -692,7 +692,7 @@
         <w:pStyle w:val="Heading2"/>
       </w:pPr>
       <w:r>
-        <w:t>2.2 仓库提交中的逐轮记录（69 条）</w:t>
+        <w:t>2.2 仓库提交中的逐轮记录（71 条）</w:t>
       </w:r>
     </w:p>
     <w:tbl>
@@ -6804,6 +6804,180 @@
                 <w:sz w:val="16"/>
               </w:rPr>
               <w:t>supervisor briefing — talk script in three lengths plus the likely questions</w:t>
+            </w:r>
+          </w:p>
+        </w:tc>
+      </w:tr>
+      <w:tr>
+        <w:tc>
+          <w:tcPr>
+            <w:tcW w:type="dxa" w:w="2448"/>
+          </w:tcPr>
+          <w:p>
+            <w:pPr>
+              <w:spacing w:after="0"/>
+            </w:pPr>
+            <w:r>
+              <w:rPr>
+                <w:sz w:val="16"/>
+              </w:rPr>
+            </w:r>
+            <w:r>
+              <w:rPr>
+                <w:sz w:val="16"/>
+              </w:rPr>
+              <w:t>Round 20ah</w:t>
+            </w:r>
+          </w:p>
+        </w:tc>
+        <w:tc>
+          <w:tcPr>
+            <w:tcW w:type="dxa" w:w="2448"/>
+          </w:tcPr>
+          <w:p>
+            <w:pPr>
+              <w:spacing w:after="0"/>
+            </w:pPr>
+            <w:r>
+              <w:rPr>
+                <w:sz w:val="16"/>
+              </w:rPr>
+            </w:r>
+            <w:r>
+              <w:rPr>
+                <w:rFonts w:ascii="Consolas" w:hAnsi="Consolas"/>
+                <w:sz w:val="16"/>
+              </w:rPr>
+              <w:t>ee0663a</w:t>
+            </w:r>
+          </w:p>
+        </w:tc>
+        <w:tc>
+          <w:tcPr>
+            <w:tcW w:type="dxa" w:w="2448"/>
+          </w:tcPr>
+          <w:p>
+            <w:pPr>
+              <w:spacing w:after="0"/>
+            </w:pPr>
+            <w:r>
+              <w:rPr>
+                <w:sz w:val="16"/>
+              </w:rPr>
+            </w:r>
+            <w:r>
+              <w:rPr>
+                <w:sz w:val="16"/>
+              </w:rPr>
+              <w:t>2026-09-27</w:t>
+            </w:r>
+          </w:p>
+        </w:tc>
+        <w:tc>
+          <w:tcPr>
+            <w:tcW w:type="dxa" w:w="2448"/>
+          </w:tcPr>
+          <w:p>
+            <w:pPr>
+              <w:spacing w:after="0"/>
+            </w:pPr>
+            <w:r>
+              <w:rPr>
+                <w:sz w:val="16"/>
+              </w:rPr>
+            </w:r>
+            <w:r>
+              <w:rPr>
+                <w:sz w:val="16"/>
+              </w:rPr>
+              <w:t>refresh the work log and package for the briefing round</w:t>
+            </w:r>
+          </w:p>
+        </w:tc>
+      </w:tr>
+      <w:tr>
+        <w:tc>
+          <w:tcPr>
+            <w:tcW w:type="dxa" w:w="2448"/>
+          </w:tcPr>
+          <w:p>
+            <w:pPr>
+              <w:spacing w:after="0"/>
+            </w:pPr>
+            <w:r>
+              <w:rPr>
+                <w:sz w:val="16"/>
+              </w:rPr>
+            </w:r>
+            <w:r>
+              <w:rPr>
+                <w:sz w:val="16"/>
+              </w:rPr>
+              <w:t>Round 20ai</w:t>
+            </w:r>
+          </w:p>
+        </w:tc>
+        <w:tc>
+          <w:tcPr>
+            <w:tcW w:type="dxa" w:w="2448"/>
+          </w:tcPr>
+          <w:p>
+            <w:pPr>
+              <w:spacing w:after="0"/>
+            </w:pPr>
+            <w:r>
+              <w:rPr>
+                <w:sz w:val="16"/>
+              </w:rPr>
+            </w:r>
+            <w:r>
+              <w:rPr>
+                <w:rFonts w:ascii="Consolas" w:hAnsi="Consolas"/>
+                <w:sz w:val="16"/>
+              </w:rPr>
+              <w:t>845c823</w:t>
+            </w:r>
+          </w:p>
+        </w:tc>
+        <w:tc>
+          <w:tcPr>
+            <w:tcW w:type="dxa" w:w="2448"/>
+          </w:tcPr>
+          <w:p>
+            <w:pPr>
+              <w:spacing w:after="0"/>
+            </w:pPr>
+            <w:r>
+              <w:rPr>
+                <w:sz w:val="16"/>
+              </w:rPr>
+            </w:r>
+            <w:r>
+              <w:rPr>
+                <w:sz w:val="16"/>
+              </w:rPr>
+              <w:t>2026-09-27</w:t>
+            </w:r>
+          </w:p>
+        </w:tc>
+        <w:tc>
+          <w:tcPr>
+            <w:tcW w:type="dxa" w:w="2448"/>
+          </w:tcPr>
+          <w:p>
+            <w:pPr>
+              <w:spacing w:after="0"/>
+            </w:pPr>
+            <w:r>
+              <w:rPr>
+                <w:sz w:val="16"/>
+              </w:rPr>
+            </w:r>
+            <w:r>
+              <w:rPr>
+                <w:sz w:val="16"/>
+              </w:rPr>
+              <w:t>eight-slide briefing deck with speaker notes</w:t>
             </w:r>
           </w:p>
         </w:tc>
@@ -7216,6 +7390,18 @@
       </w:pPr>
       <w:r>
         <w:t>submission bundle</w:t>
+      </w:r>
+    </w:p>
+    <w:p>
+      <w:pPr>
+        <w:pStyle w:val="ListNumber"/>
+        <w:numPr>
+          <w:ilvl w:val="0"/>
+          <w:numId w:val="10"/>
+        </w:numPr>
+      </w:pPr>
+      <w:r>
+        <w:t>briefing deck fit</w:t>
       </w:r>
     </w:p>
     <w:p>

</xml_diff>

<commit_message>
Round 20aj: refresh the work log and package for the data-source round
The work log lists every round commit and the package ships the current log, manifest and data-source record; the archive holds 145 files.
</commit_message>
<xml_diff>
--- a/重构版论文_v4_20260915/工作日志_论文项目.docx
+++ b/重构版论文_v4_20260915/工作日志_论文项目.docx
@@ -19,7 +19,7 @@
         <w:t>生成时间</w:t>
       </w:r>
       <w:r>
-        <w:t xml:space="preserve">：2026-09-27 16:18（由 </w:t>
+        <w:t xml:space="preserve">：2026-09-27 17:00（由 </w:t>
       </w:r>
       <w:r>
         <w:rPr>
@@ -492,7 +492,7 @@
               <w:rPr>
                 <w:sz w:val="16"/>
               </w:rPr>
-              <w:t>，145 个条目</w:t>
+              <w:t>，147 个条目</w:t>
             </w:r>
           </w:p>
         </w:tc>
@@ -692,7 +692,7 @@
         <w:pStyle w:val="Heading2"/>
       </w:pPr>
       <w:r>
-        <w:t>2.2 仓库提交中的逐轮记录（71 条）</w:t>
+        <w:t>2.2 仓库提交中的逐轮记录（73 条）</w:t>
       </w:r>
     </w:p>
     <w:tbl>
@@ -6978,6 +6978,180 @@
                 <w:sz w:val="16"/>
               </w:rPr>
               <w:t>eight-slide briefing deck with speaker notes</w:t>
+            </w:r>
+          </w:p>
+        </w:tc>
+      </w:tr>
+      <w:tr>
+        <w:tc>
+          <w:tcPr>
+            <w:tcW w:type="dxa" w:w="2448"/>
+          </w:tcPr>
+          <w:p>
+            <w:pPr>
+              <w:spacing w:after="0"/>
+            </w:pPr>
+            <w:r>
+              <w:rPr>
+                <w:sz w:val="16"/>
+              </w:rPr>
+            </w:r>
+            <w:r>
+              <w:rPr>
+                <w:sz w:val="16"/>
+              </w:rPr>
+              <w:t>Round 20ai</w:t>
+            </w:r>
+          </w:p>
+        </w:tc>
+        <w:tc>
+          <w:tcPr>
+            <w:tcW w:type="dxa" w:w="2448"/>
+          </w:tcPr>
+          <w:p>
+            <w:pPr>
+              <w:spacing w:after="0"/>
+            </w:pPr>
+            <w:r>
+              <w:rPr>
+                <w:sz w:val="16"/>
+              </w:rPr>
+            </w:r>
+            <w:r>
+              <w:rPr>
+                <w:rFonts w:ascii="Consolas" w:hAnsi="Consolas"/>
+                <w:sz w:val="16"/>
+              </w:rPr>
+              <w:t>49d5cdb</w:t>
+            </w:r>
+          </w:p>
+        </w:tc>
+        <w:tc>
+          <w:tcPr>
+            <w:tcW w:type="dxa" w:w="2448"/>
+          </w:tcPr>
+          <w:p>
+            <w:pPr>
+              <w:spacing w:after="0"/>
+            </w:pPr>
+            <w:r>
+              <w:rPr>
+                <w:sz w:val="16"/>
+              </w:rPr>
+            </w:r>
+            <w:r>
+              <w:rPr>
+                <w:sz w:val="16"/>
+              </w:rPr>
+              <w:t>2026-09-27</w:t>
+            </w:r>
+          </w:p>
+        </w:tc>
+        <w:tc>
+          <w:tcPr>
+            <w:tcW w:type="dxa" w:w="2448"/>
+          </w:tcPr>
+          <w:p>
+            <w:pPr>
+              <w:spacing w:after="0"/>
+            </w:pPr>
+            <w:r>
+              <w:rPr>
+                <w:sz w:val="16"/>
+              </w:rPr>
+            </w:r>
+            <w:r>
+              <w:rPr>
+                <w:sz w:val="16"/>
+              </w:rPr>
+              <w:t>refresh the work log and package for the deck round</w:t>
+            </w:r>
+          </w:p>
+        </w:tc>
+      </w:tr>
+      <w:tr>
+        <w:tc>
+          <w:tcPr>
+            <w:tcW w:type="dxa" w:w="2448"/>
+          </w:tcPr>
+          <w:p>
+            <w:pPr>
+              <w:spacing w:after="0"/>
+            </w:pPr>
+            <w:r>
+              <w:rPr>
+                <w:sz w:val="16"/>
+              </w:rPr>
+            </w:r>
+            <w:r>
+              <w:rPr>
+                <w:sz w:val="16"/>
+              </w:rPr>
+              <w:t>Round 20aj</w:t>
+            </w:r>
+          </w:p>
+        </w:tc>
+        <w:tc>
+          <w:tcPr>
+            <w:tcW w:type="dxa" w:w="2448"/>
+          </w:tcPr>
+          <w:p>
+            <w:pPr>
+              <w:spacing w:after="0"/>
+            </w:pPr>
+            <w:r>
+              <w:rPr>
+                <w:sz w:val="16"/>
+              </w:rPr>
+            </w:r>
+            <w:r>
+              <w:rPr>
+                <w:rFonts w:ascii="Consolas" w:hAnsi="Consolas"/>
+                <w:sz w:val="16"/>
+              </w:rPr>
+              <w:t>714b109</w:t>
+            </w:r>
+          </w:p>
+        </w:tc>
+        <w:tc>
+          <w:tcPr>
+            <w:tcW w:type="dxa" w:w="2448"/>
+          </w:tcPr>
+          <w:p>
+            <w:pPr>
+              <w:spacing w:after="0"/>
+            </w:pPr>
+            <w:r>
+              <w:rPr>
+                <w:sz w:val="16"/>
+              </w:rPr>
+            </w:r>
+            <w:r>
+              <w:rPr>
+                <w:sz w:val="16"/>
+              </w:rPr>
+              <w:t>2026-09-27</w:t>
+            </w:r>
+          </w:p>
+        </w:tc>
+        <w:tc>
+          <w:tcPr>
+            <w:tcW w:type="dxa" w:w="2448"/>
+          </w:tcPr>
+          <w:p>
+            <w:pPr>
+              <w:spacing w:after="0"/>
+            </w:pPr>
+            <w:r>
+              <w:rPr>
+                <w:sz w:val="16"/>
+              </w:rPr>
+            </w:r>
+            <w:r>
+              <w:rPr>
+                <w:sz w:val="16"/>
+              </w:rPr>
+              <w:t>one consolidated record of every data source</w:t>
             </w:r>
           </w:p>
         </w:tc>

</xml_diff>

<commit_message>
Round 20ak: refresh the work log and package for the sources-register round
The work log lists every round commit and the package ships the current log, manifest and sources register; the archive holds 145 files.
</commit_message>
<xml_diff>
--- a/重构版论文_v4_20260915/工作日志_论文项目.docx
+++ b/重构版论文_v4_20260915/工作日志_论文项目.docx
@@ -19,7 +19,7 @@
         <w:t>生成时间</w:t>
       </w:r>
       <w:r>
-        <w:t xml:space="preserve">：2026-09-27 17:00（由 </w:t>
+        <w:t xml:space="preserve">：2026-09-27 17:20（由 </w:t>
       </w:r>
       <w:r>
         <w:rPr>
@@ -692,7 +692,7 @@
         <w:pStyle w:val="Heading2"/>
       </w:pPr>
       <w:r>
-        <w:t>2.2 仓库提交中的逐轮记录（73 条）</w:t>
+        <w:t>2.2 仓库提交中的逐轮记录（75 条）</w:t>
       </w:r>
     </w:p>
     <w:tbl>
@@ -7152,6 +7152,180 @@
                 <w:sz w:val="16"/>
               </w:rPr>
               <w:t>one consolidated record of every data source</w:t>
+            </w:r>
+          </w:p>
+        </w:tc>
+      </w:tr>
+      <w:tr>
+        <w:tc>
+          <w:tcPr>
+            <w:tcW w:type="dxa" w:w="2448"/>
+          </w:tcPr>
+          <w:p>
+            <w:pPr>
+              <w:spacing w:after="0"/>
+            </w:pPr>
+            <w:r>
+              <w:rPr>
+                <w:sz w:val="16"/>
+              </w:rPr>
+            </w:r>
+            <w:r>
+              <w:rPr>
+                <w:sz w:val="16"/>
+              </w:rPr>
+              <w:t>Round 20aj</w:t>
+            </w:r>
+          </w:p>
+        </w:tc>
+        <w:tc>
+          <w:tcPr>
+            <w:tcW w:type="dxa" w:w="2448"/>
+          </w:tcPr>
+          <w:p>
+            <w:pPr>
+              <w:spacing w:after="0"/>
+            </w:pPr>
+            <w:r>
+              <w:rPr>
+                <w:sz w:val="16"/>
+              </w:rPr>
+            </w:r>
+            <w:r>
+              <w:rPr>
+                <w:rFonts w:ascii="Consolas" w:hAnsi="Consolas"/>
+                <w:sz w:val="16"/>
+              </w:rPr>
+              <w:t>776ee9b</w:t>
+            </w:r>
+          </w:p>
+        </w:tc>
+        <w:tc>
+          <w:tcPr>
+            <w:tcW w:type="dxa" w:w="2448"/>
+          </w:tcPr>
+          <w:p>
+            <w:pPr>
+              <w:spacing w:after="0"/>
+            </w:pPr>
+            <w:r>
+              <w:rPr>
+                <w:sz w:val="16"/>
+              </w:rPr>
+            </w:r>
+            <w:r>
+              <w:rPr>
+                <w:sz w:val="16"/>
+              </w:rPr>
+              <w:t>2026-09-27</w:t>
+            </w:r>
+          </w:p>
+        </w:tc>
+        <w:tc>
+          <w:tcPr>
+            <w:tcW w:type="dxa" w:w="2448"/>
+          </w:tcPr>
+          <w:p>
+            <w:pPr>
+              <w:spacing w:after="0"/>
+            </w:pPr>
+            <w:r>
+              <w:rPr>
+                <w:sz w:val="16"/>
+              </w:rPr>
+            </w:r>
+            <w:r>
+              <w:rPr>
+                <w:sz w:val="16"/>
+              </w:rPr>
+              <w:t>refresh the work log and package for the data-source round</w:t>
+            </w:r>
+          </w:p>
+        </w:tc>
+      </w:tr>
+      <w:tr>
+        <w:tc>
+          <w:tcPr>
+            <w:tcW w:type="dxa" w:w="2448"/>
+          </w:tcPr>
+          <w:p>
+            <w:pPr>
+              <w:spacing w:after="0"/>
+            </w:pPr>
+            <w:r>
+              <w:rPr>
+                <w:sz w:val="16"/>
+              </w:rPr>
+            </w:r>
+            <w:r>
+              <w:rPr>
+                <w:sz w:val="16"/>
+              </w:rPr>
+              <w:t>Round 20ak</w:t>
+            </w:r>
+          </w:p>
+        </w:tc>
+        <w:tc>
+          <w:tcPr>
+            <w:tcW w:type="dxa" w:w="2448"/>
+          </w:tcPr>
+          <w:p>
+            <w:pPr>
+              <w:spacing w:after="0"/>
+            </w:pPr>
+            <w:r>
+              <w:rPr>
+                <w:sz w:val="16"/>
+              </w:rPr>
+            </w:r>
+            <w:r>
+              <w:rPr>
+                <w:rFonts w:ascii="Consolas" w:hAnsi="Consolas"/>
+                <w:sz w:val="16"/>
+              </w:rPr>
+              <w:t>8c003a5</w:t>
+            </w:r>
+          </w:p>
+        </w:tc>
+        <w:tc>
+          <w:tcPr>
+            <w:tcW w:type="dxa" w:w="2448"/>
+          </w:tcPr>
+          <w:p>
+            <w:pPr>
+              <w:spacing w:after="0"/>
+            </w:pPr>
+            <w:r>
+              <w:rPr>
+                <w:sz w:val="16"/>
+              </w:rPr>
+            </w:r>
+            <w:r>
+              <w:rPr>
+                <w:sz w:val="16"/>
+              </w:rPr>
+              <w:t>2026-09-27</w:t>
+            </w:r>
+          </w:p>
+        </w:tc>
+        <w:tc>
+          <w:tcPr>
+            <w:tcW w:type="dxa" w:w="2448"/>
+          </w:tcPr>
+          <w:p>
+            <w:pPr>
+              <w:spacing w:after="0"/>
+            </w:pPr>
+            <w:r>
+              <w:rPr>
+                <w:sz w:val="16"/>
+              </w:rPr>
+            </w:r>
+            <w:r>
+              <w:rPr>
+                <w:sz w:val="16"/>
+              </w:rPr>
+              <w:t>the sources register now covers software, literature, requirements and archives</w:t>
             </w:r>
           </w:p>
         </w:tc>

</xml_diff>

<commit_message>
Round 20al: refresh the work log and package for the equation round
The work log lists every round commit and the package ships the current log, manifest and equation record; the archive holds 147 files.
</commit_message>
<xml_diff>
--- a/重构版论文_v4_20260915/工作日志_论文项目.docx
+++ b/重构版论文_v4_20260915/工作日志_论文项目.docx
@@ -19,7 +19,7 @@
         <w:t>生成时间</w:t>
       </w:r>
       <w:r>
-        <w:t xml:space="preserve">：2026-09-27 17:20（由 </w:t>
+        <w:t xml:space="preserve">：2026-09-27 17:31（由 </w:t>
       </w:r>
       <w:r>
         <w:rPr>
@@ -252,7 +252,7 @@
               <w:rPr>
                 <w:sz w:val="16"/>
               </w:rPr>
-              <w:t>47 项检查全绿（</w:t>
+              <w:t>48 项检查全绿（</w:t>
             </w:r>
             <w:r>
               <w:rPr>
@@ -492,7 +492,7 @@
               <w:rPr>
                 <w:sz w:val="16"/>
               </w:rPr>
-              <w:t>，147 个条目</w:t>
+              <w:t>，149 个条目</w:t>
             </w:r>
           </w:p>
         </w:tc>
@@ -692,7 +692,7 @@
         <w:pStyle w:val="Heading2"/>
       </w:pPr>
       <w:r>
-        <w:t>2.2 仓库提交中的逐轮记录（75 条）</w:t>
+        <w:t>2.2 仓库提交中的逐轮记录（78 条）</w:t>
       </w:r>
     </w:p>
     <w:tbl>
@@ -7326,6 +7326,267 @@
                 <w:sz w:val="16"/>
               </w:rPr>
               <w:t>the sources register now covers software, literature, requirements and archives</w:t>
+            </w:r>
+          </w:p>
+        </w:tc>
+      </w:tr>
+      <w:tr>
+        <w:tc>
+          <w:tcPr>
+            <w:tcW w:type="dxa" w:w="2448"/>
+          </w:tcPr>
+          <w:p>
+            <w:pPr>
+              <w:spacing w:after="0"/>
+            </w:pPr>
+            <w:r>
+              <w:rPr>
+                <w:sz w:val="16"/>
+              </w:rPr>
+            </w:r>
+            <w:r>
+              <w:rPr>
+                <w:sz w:val="16"/>
+              </w:rPr>
+              <w:t>Round 20ak</w:t>
+            </w:r>
+          </w:p>
+        </w:tc>
+        <w:tc>
+          <w:tcPr>
+            <w:tcW w:type="dxa" w:w="2448"/>
+          </w:tcPr>
+          <w:p>
+            <w:pPr>
+              <w:spacing w:after="0"/>
+            </w:pPr>
+            <w:r>
+              <w:rPr>
+                <w:sz w:val="16"/>
+              </w:rPr>
+            </w:r>
+            <w:r>
+              <w:rPr>
+                <w:rFonts w:ascii="Consolas" w:hAnsi="Consolas"/>
+                <w:sz w:val="16"/>
+              </w:rPr>
+              <w:t>7498c71</w:t>
+            </w:r>
+          </w:p>
+        </w:tc>
+        <w:tc>
+          <w:tcPr>
+            <w:tcW w:type="dxa" w:w="2448"/>
+          </w:tcPr>
+          <w:p>
+            <w:pPr>
+              <w:spacing w:after="0"/>
+            </w:pPr>
+            <w:r>
+              <w:rPr>
+                <w:sz w:val="16"/>
+              </w:rPr>
+            </w:r>
+            <w:r>
+              <w:rPr>
+                <w:sz w:val="16"/>
+              </w:rPr>
+              <w:t>2026-09-27</w:t>
+            </w:r>
+          </w:p>
+        </w:tc>
+        <w:tc>
+          <w:tcPr>
+            <w:tcW w:type="dxa" w:w="2448"/>
+          </w:tcPr>
+          <w:p>
+            <w:pPr>
+              <w:spacing w:after="0"/>
+            </w:pPr>
+            <w:r>
+              <w:rPr>
+                <w:sz w:val="16"/>
+              </w:rPr>
+            </w:r>
+            <w:r>
+              <w:rPr>
+                <w:sz w:val="16"/>
+              </w:rPr>
+              <w:t>refresh the work log and package for the sources-register round</w:t>
+            </w:r>
+          </w:p>
+        </w:tc>
+      </w:tr>
+      <w:tr>
+        <w:tc>
+          <w:tcPr>
+            <w:tcW w:type="dxa" w:w="2448"/>
+          </w:tcPr>
+          <w:p>
+            <w:pPr>
+              <w:spacing w:after="0"/>
+            </w:pPr>
+            <w:r>
+              <w:rPr>
+                <w:sz w:val="16"/>
+              </w:rPr>
+            </w:r>
+            <w:r>
+              <w:rPr>
+                <w:sz w:val="16"/>
+              </w:rPr>
+              <w:t>Round 20ak</w:t>
+            </w:r>
+          </w:p>
+        </w:tc>
+        <w:tc>
+          <w:tcPr>
+            <w:tcW w:type="dxa" w:w="2448"/>
+          </w:tcPr>
+          <w:p>
+            <w:pPr>
+              <w:spacing w:after="0"/>
+            </w:pPr>
+            <w:r>
+              <w:rPr>
+                <w:sz w:val="16"/>
+              </w:rPr>
+            </w:r>
+            <w:r>
+              <w:rPr>
+                <w:rFonts w:ascii="Consolas" w:hAnsi="Consolas"/>
+                <w:sz w:val="16"/>
+              </w:rPr>
+              <w:t>ea756c0</w:t>
+            </w:r>
+          </w:p>
+        </w:tc>
+        <w:tc>
+          <w:tcPr>
+            <w:tcW w:type="dxa" w:w="2448"/>
+          </w:tcPr>
+          <w:p>
+            <w:pPr>
+              <w:spacing w:after="0"/>
+            </w:pPr>
+            <w:r>
+              <w:rPr>
+                <w:sz w:val="16"/>
+              </w:rPr>
+            </w:r>
+            <w:r>
+              <w:rPr>
+                <w:sz w:val="16"/>
+              </w:rPr>
+              <w:t>2026-09-27</w:t>
+            </w:r>
+          </w:p>
+        </w:tc>
+        <w:tc>
+          <w:tcPr>
+            <w:tcW w:type="dxa" w:w="2448"/>
+          </w:tcPr>
+          <w:p>
+            <w:pPr>
+              <w:spacing w:after="0"/>
+            </w:pPr>
+            <w:r>
+              <w:rPr>
+                <w:sz w:val="16"/>
+              </w:rPr>
+            </w:r>
+            <w:r>
+              <w:rPr>
+                <w:sz w:val="16"/>
+              </w:rPr>
+              <w:t>retire the superseded desktop copies of the sources document</w:t>
+            </w:r>
+          </w:p>
+        </w:tc>
+      </w:tr>
+      <w:tr>
+        <w:tc>
+          <w:tcPr>
+            <w:tcW w:type="dxa" w:w="2448"/>
+          </w:tcPr>
+          <w:p>
+            <w:pPr>
+              <w:spacing w:after="0"/>
+            </w:pPr>
+            <w:r>
+              <w:rPr>
+                <w:sz w:val="16"/>
+              </w:rPr>
+            </w:r>
+            <w:r>
+              <w:rPr>
+                <w:sz w:val="16"/>
+              </w:rPr>
+              <w:t>Round 20al</w:t>
+            </w:r>
+          </w:p>
+        </w:tc>
+        <w:tc>
+          <w:tcPr>
+            <w:tcW w:type="dxa" w:w="2448"/>
+          </w:tcPr>
+          <w:p>
+            <w:pPr>
+              <w:spacing w:after="0"/>
+            </w:pPr>
+            <w:r>
+              <w:rPr>
+                <w:sz w:val="16"/>
+              </w:rPr>
+            </w:r>
+            <w:r>
+              <w:rPr>
+                <w:rFonts w:ascii="Consolas" w:hAnsi="Consolas"/>
+                <w:sz w:val="16"/>
+              </w:rPr>
+              <w:t>74026eb</w:t>
+            </w:r>
+          </w:p>
+        </w:tc>
+        <w:tc>
+          <w:tcPr>
+            <w:tcW w:type="dxa" w:w="2448"/>
+          </w:tcPr>
+          <w:p>
+            <w:pPr>
+              <w:spacing w:after="0"/>
+            </w:pPr>
+            <w:r>
+              <w:rPr>
+                <w:sz w:val="16"/>
+              </w:rPr>
+            </w:r>
+            <w:r>
+              <w:rPr>
+                <w:sz w:val="16"/>
+              </w:rPr>
+              <w:t>2026-09-27</w:t>
+            </w:r>
+          </w:p>
+        </w:tc>
+        <w:tc>
+          <w:tcPr>
+            <w:tcW w:type="dxa" w:w="2448"/>
+          </w:tcPr>
+          <w:p>
+            <w:pPr>
+              <w:spacing w:after="0"/>
+            </w:pPr>
+            <w:r>
+              <w:rPr>
+                <w:sz w:val="16"/>
+              </w:rPr>
+            </w:r>
+            <w:r>
+              <w:rPr>
+                <w:sz w:val="16"/>
+              </w:rPr>
+              <w:t>provenance and verification for each of the five equations</w:t>
             </w:r>
           </w:p>
         </w:tc>
@@ -7750,6 +8011,18 @@
       </w:pPr>
       <w:r>
         <w:t>briefing deck fit</w:t>
+      </w:r>
+    </w:p>
+    <w:p>
+      <w:pPr>
+        <w:pStyle w:val="ListNumber"/>
+        <w:numPr>
+          <w:ilvl w:val="0"/>
+          <w:numId w:val="10"/>
+        </w:numPr>
+      </w:pPr>
+      <w:r>
+        <w:t>equation sources</w:t>
       </w:r>
     </w:p>
     <w:p>

</xml_diff>

<commit_message>
Round 20am: refresh the work log and package for the pipeline round
The work log lists every round commit and the package ships the current log, manifest and pipeline document; the archive holds 150 files.
</commit_message>
<xml_diff>
--- a/重构版论文_v4_20260915/工作日志_论文项目.docx
+++ b/重构版论文_v4_20260915/工作日志_论文项目.docx
@@ -19,7 +19,7 @@
         <w:t>生成时间</w:t>
       </w:r>
       <w:r>
-        <w:t xml:space="preserve">：2026-09-27 17:31（由 </w:t>
+        <w:t xml:space="preserve">：2026-09-27 17:41（由 </w:t>
       </w:r>
       <w:r>
         <w:rPr>
@@ -492,7 +492,7 @@
               <w:rPr>
                 <w:sz w:val="16"/>
               </w:rPr>
-              <w:t>，149 个条目</w:t>
+              <w:t>，152 个条目</w:t>
             </w:r>
           </w:p>
         </w:tc>
@@ -692,7 +692,7 @@
         <w:pStyle w:val="Heading2"/>
       </w:pPr>
       <w:r>
-        <w:t>2.2 仓库提交中的逐轮记录（78 条）</w:t>
+        <w:t>2.2 仓库提交中的逐轮记录（80 条）</w:t>
       </w:r>
     </w:p>
     <w:tbl>
@@ -7587,6 +7587,180 @@
                 <w:sz w:val="16"/>
               </w:rPr>
               <w:t>provenance and verification for each of the five equations</w:t>
+            </w:r>
+          </w:p>
+        </w:tc>
+      </w:tr>
+      <w:tr>
+        <w:tc>
+          <w:tcPr>
+            <w:tcW w:type="dxa" w:w="2448"/>
+          </w:tcPr>
+          <w:p>
+            <w:pPr>
+              <w:spacing w:after="0"/>
+            </w:pPr>
+            <w:r>
+              <w:rPr>
+                <w:sz w:val="16"/>
+              </w:rPr>
+            </w:r>
+            <w:r>
+              <w:rPr>
+                <w:sz w:val="16"/>
+              </w:rPr>
+              <w:t>Round 20al</w:t>
+            </w:r>
+          </w:p>
+        </w:tc>
+        <w:tc>
+          <w:tcPr>
+            <w:tcW w:type="dxa" w:w="2448"/>
+          </w:tcPr>
+          <w:p>
+            <w:pPr>
+              <w:spacing w:after="0"/>
+            </w:pPr>
+            <w:r>
+              <w:rPr>
+                <w:sz w:val="16"/>
+              </w:rPr>
+            </w:r>
+            <w:r>
+              <w:rPr>
+                <w:rFonts w:ascii="Consolas" w:hAnsi="Consolas"/>
+                <w:sz w:val="16"/>
+              </w:rPr>
+              <w:t>0ab655f</w:t>
+            </w:r>
+          </w:p>
+        </w:tc>
+        <w:tc>
+          <w:tcPr>
+            <w:tcW w:type="dxa" w:w="2448"/>
+          </w:tcPr>
+          <w:p>
+            <w:pPr>
+              <w:spacing w:after="0"/>
+            </w:pPr>
+            <w:r>
+              <w:rPr>
+                <w:sz w:val="16"/>
+              </w:rPr>
+            </w:r>
+            <w:r>
+              <w:rPr>
+                <w:sz w:val="16"/>
+              </w:rPr>
+              <w:t>2026-09-27</w:t>
+            </w:r>
+          </w:p>
+        </w:tc>
+        <w:tc>
+          <w:tcPr>
+            <w:tcW w:type="dxa" w:w="2448"/>
+          </w:tcPr>
+          <w:p>
+            <w:pPr>
+              <w:spacing w:after="0"/>
+            </w:pPr>
+            <w:r>
+              <w:rPr>
+                <w:sz w:val="16"/>
+              </w:rPr>
+            </w:r>
+            <w:r>
+              <w:rPr>
+                <w:sz w:val="16"/>
+              </w:rPr>
+              <w:t>refresh the work log and package for the equation round</w:t>
+            </w:r>
+          </w:p>
+        </w:tc>
+      </w:tr>
+      <w:tr>
+        <w:tc>
+          <w:tcPr>
+            <w:tcW w:type="dxa" w:w="2448"/>
+          </w:tcPr>
+          <w:p>
+            <w:pPr>
+              <w:spacing w:after="0"/>
+            </w:pPr>
+            <w:r>
+              <w:rPr>
+                <w:sz w:val="16"/>
+              </w:rPr>
+            </w:r>
+            <w:r>
+              <w:rPr>
+                <w:sz w:val="16"/>
+              </w:rPr>
+              <w:t>Round 20am</w:t>
+            </w:r>
+          </w:p>
+        </w:tc>
+        <w:tc>
+          <w:tcPr>
+            <w:tcW w:type="dxa" w:w="2448"/>
+          </w:tcPr>
+          <w:p>
+            <w:pPr>
+              <w:spacing w:after="0"/>
+            </w:pPr>
+            <w:r>
+              <w:rPr>
+                <w:sz w:val="16"/>
+              </w:rPr>
+            </w:r>
+            <w:r>
+              <w:rPr>
+                <w:rFonts w:ascii="Consolas" w:hAnsi="Consolas"/>
+                <w:sz w:val="16"/>
+              </w:rPr>
+              <w:t>f0b3708</w:t>
+            </w:r>
+          </w:p>
+        </w:tc>
+        <w:tc>
+          <w:tcPr>
+            <w:tcW w:type="dxa" w:w="2448"/>
+          </w:tcPr>
+          <w:p>
+            <w:pPr>
+              <w:spacing w:after="0"/>
+            </w:pPr>
+            <w:r>
+              <w:rPr>
+                <w:sz w:val="16"/>
+              </w:rPr>
+            </w:r>
+            <w:r>
+              <w:rPr>
+                <w:sz w:val="16"/>
+              </w:rPr>
+              <w:t>2026-09-27</w:t>
+            </w:r>
+          </w:p>
+        </w:tc>
+        <w:tc>
+          <w:tcPr>
+            <w:tcW w:type="dxa" w:w="2448"/>
+          </w:tcPr>
+          <w:p>
+            <w:pPr>
+              <w:spacing w:after="0"/>
+            </w:pPr>
+            <w:r>
+              <w:rPr>
+                <w:sz w:val="16"/>
+              </w:rPr>
+            </w:r>
+            <w:r>
+              <w:rPr>
+                <w:sz w:val="16"/>
+              </w:rPr>
+              <w:t>data-processing code and flow, with figures and a run record</w:t>
             </w:r>
           </w:p>
         </w:tc>

</xml_diff>

<commit_message>
Round 20an: refresh the work log and package for the flowchart round
</commit_message>
<xml_diff>
--- a/重构版论文_v4_20260915/工作日志_论文项目.docx
+++ b/重构版论文_v4_20260915/工作日志_论文项目.docx
@@ -19,7 +19,7 @@
         <w:t>生成时间</w:t>
       </w:r>
       <w:r>
-        <w:t xml:space="preserve">：2026-09-27 17:57（由 </w:t>
+        <w:t xml:space="preserve">：2026-09-27 18:16（由 </w:t>
       </w:r>
       <w:r>
         <w:rPr>
@@ -692,7 +692,7 @@
         <w:pStyle w:val="Heading2"/>
       </w:pPr>
       <w:r>
-        <w:t>2.2 仓库提交中的逐轮记录（81 条）</w:t>
+        <w:t>2.2 仓库提交中的逐轮记录（82 条）</w:t>
       </w:r>
     </w:p>
     <w:tbl>
@@ -7848,6 +7848,93 @@
                 <w:sz w:val="16"/>
               </w:rPr>
               <w:t>refresh the work log and package for the pipeline round</w:t>
+            </w:r>
+          </w:p>
+        </w:tc>
+      </w:tr>
+      <w:tr>
+        <w:tc>
+          <w:tcPr>
+            <w:tcW w:type="dxa" w:w="2448"/>
+          </w:tcPr>
+          <w:p>
+            <w:pPr>
+              <w:spacing w:after="0"/>
+            </w:pPr>
+            <w:r>
+              <w:rPr>
+                <w:sz w:val="16"/>
+              </w:rPr>
+            </w:r>
+            <w:r>
+              <w:rPr>
+                <w:sz w:val="16"/>
+              </w:rPr>
+              <w:t>Round 20an</w:t>
+            </w:r>
+          </w:p>
+        </w:tc>
+        <w:tc>
+          <w:tcPr>
+            <w:tcW w:type="dxa" w:w="2448"/>
+          </w:tcPr>
+          <w:p>
+            <w:pPr>
+              <w:spacing w:after="0"/>
+            </w:pPr>
+            <w:r>
+              <w:rPr>
+                <w:sz w:val="16"/>
+              </w:rPr>
+            </w:r>
+            <w:r>
+              <w:rPr>
+                <w:rFonts w:ascii="Consolas" w:hAnsi="Consolas"/>
+                <w:sz w:val="16"/>
+              </w:rPr>
+              <w:t>7d0ed6b</w:t>
+            </w:r>
+          </w:p>
+        </w:tc>
+        <w:tc>
+          <w:tcPr>
+            <w:tcW w:type="dxa" w:w="2448"/>
+          </w:tcPr>
+          <w:p>
+            <w:pPr>
+              <w:spacing w:after="0"/>
+            </w:pPr>
+            <w:r>
+              <w:rPr>
+                <w:sz w:val="16"/>
+              </w:rPr>
+            </w:r>
+            <w:r>
+              <w:rPr>
+                <w:sz w:val="16"/>
+              </w:rPr>
+              <w:t>2026-09-27</w:t>
+            </w:r>
+          </w:p>
+        </w:tc>
+        <w:tc>
+          <w:tcPr>
+            <w:tcW w:type="dxa" w:w="2448"/>
+          </w:tcPr>
+          <w:p>
+            <w:pPr>
+              <w:spacing w:after="0"/>
+            </w:pPr>
+            <w:r>
+              <w:rPr>
+                <w:sz w:val="16"/>
+              </w:rPr>
+            </w:r>
+            <w:r>
+              <w:rPr>
+                <w:sz w:val="16"/>
+              </w:rPr>
+              <w:t>project flowchart, and the gate and archive counts it exposed</w:t>
             </w:r>
           </w:p>
         </w:tc>

</xml_diff>

<commit_message>
Round 20ao: refresh the work log and package for the briefing round
</commit_message>
<xml_diff>
--- a/重构版论文_v4_20260915/工作日志_论文项目.docx
+++ b/重构版论文_v4_20260915/工作日志_论文项目.docx
@@ -19,7 +19,7 @@
         <w:t>生成时间</w:t>
       </w:r>
       <w:r>
-        <w:t xml:space="preserve">：2026-09-27 18:16（由 </w:t>
+        <w:t xml:space="preserve">：2026-09-27 19:27（由 </w:t>
       </w:r>
       <w:r>
         <w:rPr>
@@ -692,7 +692,7 @@
         <w:pStyle w:val="Heading2"/>
       </w:pPr>
       <w:r>
-        <w:t>2.2 仓库提交中的逐轮记录（82 条）</w:t>
+        <w:t>2.2 仓库提交中的逐轮记录（84 条）</w:t>
       </w:r>
     </w:p>
     <w:tbl>
@@ -7935,6 +7935,180 @@
                 <w:sz w:val="16"/>
               </w:rPr>
               <w:t>project flowchart, and the gate and archive counts it exposed</w:t>
+            </w:r>
+          </w:p>
+        </w:tc>
+      </w:tr>
+      <w:tr>
+        <w:tc>
+          <w:tcPr>
+            <w:tcW w:type="dxa" w:w="2448"/>
+          </w:tcPr>
+          <w:p>
+            <w:pPr>
+              <w:spacing w:after="0"/>
+            </w:pPr>
+            <w:r>
+              <w:rPr>
+                <w:sz w:val="16"/>
+              </w:rPr>
+            </w:r>
+            <w:r>
+              <w:rPr>
+                <w:sz w:val="16"/>
+              </w:rPr>
+              <w:t>Round 20an</w:t>
+            </w:r>
+          </w:p>
+        </w:tc>
+        <w:tc>
+          <w:tcPr>
+            <w:tcW w:type="dxa" w:w="2448"/>
+          </w:tcPr>
+          <w:p>
+            <w:pPr>
+              <w:spacing w:after="0"/>
+            </w:pPr>
+            <w:r>
+              <w:rPr>
+                <w:sz w:val="16"/>
+              </w:rPr>
+            </w:r>
+            <w:r>
+              <w:rPr>
+                <w:rFonts w:ascii="Consolas" w:hAnsi="Consolas"/>
+                <w:sz w:val="16"/>
+              </w:rPr>
+              <w:t>864213e</w:t>
+            </w:r>
+          </w:p>
+        </w:tc>
+        <w:tc>
+          <w:tcPr>
+            <w:tcW w:type="dxa" w:w="2448"/>
+          </w:tcPr>
+          <w:p>
+            <w:pPr>
+              <w:spacing w:after="0"/>
+            </w:pPr>
+            <w:r>
+              <w:rPr>
+                <w:sz w:val="16"/>
+              </w:rPr>
+            </w:r>
+            <w:r>
+              <w:rPr>
+                <w:sz w:val="16"/>
+              </w:rPr>
+              <w:t>2026-09-27</w:t>
+            </w:r>
+          </w:p>
+        </w:tc>
+        <w:tc>
+          <w:tcPr>
+            <w:tcW w:type="dxa" w:w="2448"/>
+          </w:tcPr>
+          <w:p>
+            <w:pPr>
+              <w:spacing w:after="0"/>
+            </w:pPr>
+            <w:r>
+              <w:rPr>
+                <w:sz w:val="16"/>
+              </w:rPr>
+            </w:r>
+            <w:r>
+              <w:rPr>
+                <w:sz w:val="16"/>
+              </w:rPr>
+              <w:t>refresh the work log and package for the flowchart round</w:t>
+            </w:r>
+          </w:p>
+        </w:tc>
+      </w:tr>
+      <w:tr>
+        <w:tc>
+          <w:tcPr>
+            <w:tcW w:type="dxa" w:w="2448"/>
+          </w:tcPr>
+          <w:p>
+            <w:pPr>
+              <w:spacing w:after="0"/>
+            </w:pPr>
+            <w:r>
+              <w:rPr>
+                <w:sz w:val="16"/>
+              </w:rPr>
+            </w:r>
+            <w:r>
+              <w:rPr>
+                <w:sz w:val="16"/>
+              </w:rPr>
+              <w:t>Round 20ao</w:t>
+            </w:r>
+          </w:p>
+        </w:tc>
+        <w:tc>
+          <w:tcPr>
+            <w:tcW w:type="dxa" w:w="2448"/>
+          </w:tcPr>
+          <w:p>
+            <w:pPr>
+              <w:spacing w:after="0"/>
+            </w:pPr>
+            <w:r>
+              <w:rPr>
+                <w:sz w:val="16"/>
+              </w:rPr>
+            </w:r>
+            <w:r>
+              <w:rPr>
+                <w:rFonts w:ascii="Consolas" w:hAnsi="Consolas"/>
+                <w:sz w:val="16"/>
+              </w:rPr>
+              <w:t>61ebdc5</w:t>
+            </w:r>
+          </w:p>
+        </w:tc>
+        <w:tc>
+          <w:tcPr>
+            <w:tcW w:type="dxa" w:w="2448"/>
+          </w:tcPr>
+          <w:p>
+            <w:pPr>
+              <w:spacing w:after="0"/>
+            </w:pPr>
+            <w:r>
+              <w:rPr>
+                <w:sz w:val="16"/>
+              </w:rPr>
+            </w:r>
+            <w:r>
+              <w:rPr>
+                <w:sz w:val="16"/>
+              </w:rPr>
+              <w:t>2026-09-27</w:t>
+            </w:r>
+          </w:p>
+        </w:tc>
+        <w:tc>
+          <w:tcPr>
+            <w:tcW w:type="dxa" w:w="2448"/>
+          </w:tcPr>
+          <w:p>
+            <w:pPr>
+              <w:spacing w:after="0"/>
+            </w:pPr>
+            <w:r>
+              <w:rPr>
+                <w:sz w:val="16"/>
+              </w:rPr>
+            </w:r>
+            <w:r>
+              <w:rPr>
+                <w:sz w:val="16"/>
+              </w:rPr>
+              <w:t>fuller briefing materials - intro dossier, 22-question script, 12-slide deck</w:t>
             </w:r>
           </w:p>
         </w:tc>

</xml_diff>

<commit_message>
Round 20ap: refresh the work log and package for the experiment-record round
</commit_message>
<xml_diff>
--- a/重构版论文_v4_20260915/工作日志_论文项目.docx
+++ b/重构版论文_v4_20260915/工作日志_论文项目.docx
@@ -19,7 +19,7 @@
         <w:t>生成时间</w:t>
       </w:r>
       <w:r>
-        <w:t xml:space="preserve">：2026-09-27 19:44（由 </w:t>
+        <w:t xml:space="preserve">：2026-09-27 19:54（由 </w:t>
       </w:r>
       <w:r>
         <w:rPr>
@@ -692,7 +692,7 @@
         <w:pStyle w:val="Heading2"/>
       </w:pPr>
       <w:r>
-        <w:t>2.2 仓库提交中的逐轮记录（85 条）</w:t>
+        <w:t>2.2 仓库提交中的逐轮记录（86 条）</w:t>
       </w:r>
     </w:p>
     <w:tbl>
@@ -8196,6 +8196,93 @@
                 <w:sz w:val="16"/>
               </w:rPr>
               <w:t>refresh the work log and package for the briefing round</w:t>
+            </w:r>
+          </w:p>
+        </w:tc>
+      </w:tr>
+      <w:tr>
+        <w:tc>
+          <w:tcPr>
+            <w:tcW w:type="dxa" w:w="2448"/>
+          </w:tcPr>
+          <w:p>
+            <w:pPr>
+              <w:spacing w:after="0"/>
+            </w:pPr>
+            <w:r>
+              <w:rPr>
+                <w:sz w:val="16"/>
+              </w:rPr>
+            </w:r>
+            <w:r>
+              <w:rPr>
+                <w:sz w:val="16"/>
+              </w:rPr>
+              <w:t>Round 20ap</w:t>
+            </w:r>
+          </w:p>
+        </w:tc>
+        <w:tc>
+          <w:tcPr>
+            <w:tcW w:type="dxa" w:w="2448"/>
+          </w:tcPr>
+          <w:p>
+            <w:pPr>
+              <w:spacing w:after="0"/>
+            </w:pPr>
+            <w:r>
+              <w:rPr>
+                <w:sz w:val="16"/>
+              </w:rPr>
+            </w:r>
+            <w:r>
+              <w:rPr>
+                <w:rFonts w:ascii="Consolas" w:hAnsi="Consolas"/>
+                <w:sz w:val="16"/>
+              </w:rPr>
+              <w:t>69d25dd</w:t>
+            </w:r>
+          </w:p>
+        </w:tc>
+        <w:tc>
+          <w:tcPr>
+            <w:tcW w:type="dxa" w:w="2448"/>
+          </w:tcPr>
+          <w:p>
+            <w:pPr>
+              <w:spacing w:after="0"/>
+            </w:pPr>
+            <w:r>
+              <w:rPr>
+                <w:sz w:val="16"/>
+              </w:rPr>
+            </w:r>
+            <w:r>
+              <w:rPr>
+                <w:sz w:val="16"/>
+              </w:rPr>
+              <w:t>2026-09-27</w:t>
+            </w:r>
+          </w:p>
+        </w:tc>
+        <w:tc>
+          <w:tcPr>
+            <w:tcW w:type="dxa" w:w="2448"/>
+          </w:tcPr>
+          <w:p>
+            <w:pPr>
+              <w:spacing w:after="0"/>
+            </w:pPr>
+            <w:r>
+              <w:rPr>
+                <w:sz w:val="16"/>
+              </w:rPr>
+            </w:r>
+            <w:r>
+              <w:rPr>
+                <w:sz w:val="16"/>
+              </w:rPr>
+              <w:t>experiment record - 18 experiments with code, run logs and rendered evidence</w:t>
             </w:r>
           </w:p>
         </w:tc>

</xml_diff>

<commit_message>
Round 20aq: refresh the work log and package for the full-inventory round
</commit_message>
<xml_diff>
--- a/重构版论文_v4_20260915/工作日志_论文项目.docx
+++ b/重构版论文_v4_20260915/工作日志_论文项目.docx
@@ -19,7 +19,7 @@
         <w:t>生成时间</w:t>
       </w:r>
       <w:r>
-        <w:t xml:space="preserve">：2026-09-27 22:52（由 </w:t>
+        <w:t xml:space="preserve">：2026-09-27 23:10（由 </w:t>
       </w:r>
       <w:r>
         <w:rPr>
@@ -692,7 +692,7 @@
         <w:pStyle w:val="Heading2"/>
       </w:pPr>
       <w:r>
-        <w:t>2.2 仓库提交中的逐轮记录（87 条）</w:t>
+        <w:t>2.2 仓库提交中的逐轮记录（88 条）</w:t>
       </w:r>
     </w:p>
     <w:tbl>
@@ -8370,6 +8370,93 @@
                 <w:sz w:val="16"/>
               </w:rPr>
               <w:t>refresh the work log and package for the experiment-record round</w:t>
+            </w:r>
+          </w:p>
+        </w:tc>
+      </w:tr>
+      <w:tr>
+        <w:tc>
+          <w:tcPr>
+            <w:tcW w:type="dxa" w:w="2448"/>
+          </w:tcPr>
+          <w:p>
+            <w:pPr>
+              <w:spacing w:after="0"/>
+            </w:pPr>
+            <w:r>
+              <w:rPr>
+                <w:sz w:val="16"/>
+              </w:rPr>
+            </w:r>
+            <w:r>
+              <w:rPr>
+                <w:sz w:val="16"/>
+              </w:rPr>
+              <w:t>Round 20aq</w:t>
+            </w:r>
+          </w:p>
+        </w:tc>
+        <w:tc>
+          <w:tcPr>
+            <w:tcW w:type="dxa" w:w="2448"/>
+          </w:tcPr>
+          <w:p>
+            <w:pPr>
+              <w:spacing w:after="0"/>
+            </w:pPr>
+            <w:r>
+              <w:rPr>
+                <w:sz w:val="16"/>
+              </w:rPr>
+            </w:r>
+            <w:r>
+              <w:rPr>
+                <w:rFonts w:ascii="Consolas" w:hAnsi="Consolas"/>
+                <w:sz w:val="16"/>
+              </w:rPr>
+              <w:t>a9379a3</w:t>
+            </w:r>
+          </w:p>
+        </w:tc>
+        <w:tc>
+          <w:tcPr>
+            <w:tcW w:type="dxa" w:w="2448"/>
+          </w:tcPr>
+          <w:p>
+            <w:pPr>
+              <w:spacing w:after="0"/>
+            </w:pPr>
+            <w:r>
+              <w:rPr>
+                <w:sz w:val="16"/>
+              </w:rPr>
+            </w:r>
+            <w:r>
+              <w:rPr>
+                <w:sz w:val="16"/>
+              </w:rPr>
+              <w:t>2026-09-27</w:t>
+            </w:r>
+          </w:p>
+        </w:tc>
+        <w:tc>
+          <w:tcPr>
+            <w:tcW w:type="dxa" w:w="2448"/>
+          </w:tcPr>
+          <w:p>
+            <w:pPr>
+              <w:spacing w:after="0"/>
+            </w:pPr>
+            <w:r>
+              <w:rPr>
+                <w:sz w:val="16"/>
+              </w:rPr>
+            </w:r>
+            <w:r>
+              <w:rPr>
+                <w:sz w:val="16"/>
+              </w:rPr>
+              <w:t>full experiment inventory - 145 result directories, 378 code files, 25 record panels</w:t>
             </w:r>
           </w:p>
         </w:tc>

</xml_diff>

<commit_message>
Round 20ar: refresh the work log and package for the material-index round
</commit_message>
<xml_diff>
--- a/重构版论文_v4_20260915/工作日志_论文项目.docx
+++ b/重构版论文_v4_20260915/工作日志_论文项目.docx
@@ -19,7 +19,7 @@
         <w:t>生成时间</w:t>
       </w:r>
       <w:r>
-        <w:t xml:space="preserve">：2026-09-28 00:11（由 </w:t>
+        <w:t xml:space="preserve">：2026-09-28 00:38（由 </w:t>
       </w:r>
       <w:r>
         <w:rPr>
@@ -492,7 +492,7 @@
               <w:rPr>
                 <w:sz w:val="16"/>
               </w:rPr>
-              <w:t>，783 个条目</w:t>
+              <w:t>，785 个条目</w:t>
             </w:r>
           </w:p>
         </w:tc>
@@ -692,7 +692,7 @@
         <w:pStyle w:val="Heading2"/>
       </w:pPr>
       <w:r>
-        <w:t>2.2 仓库提交中的逐轮记录（89 条）</w:t>
+        <w:t>2.2 仓库提交中的逐轮记录（90 条）</w:t>
       </w:r>
     </w:p>
     <w:tbl>
@@ -8544,6 +8544,93 @@
                 <w:sz w:val="16"/>
               </w:rPr>
               <w:t>refresh the work log and package for the full-inventory round</w:t>
+            </w:r>
+          </w:p>
+        </w:tc>
+      </w:tr>
+      <w:tr>
+        <w:tc>
+          <w:tcPr>
+            <w:tcW w:type="dxa" w:w="2448"/>
+          </w:tcPr>
+          <w:p>
+            <w:pPr>
+              <w:spacing w:after="0"/>
+            </w:pPr>
+            <w:r>
+              <w:rPr>
+                <w:sz w:val="16"/>
+              </w:rPr>
+            </w:r>
+            <w:r>
+              <w:rPr>
+                <w:sz w:val="16"/>
+              </w:rPr>
+              <w:t>Round 20ar</w:t>
+            </w:r>
+          </w:p>
+        </w:tc>
+        <w:tc>
+          <w:tcPr>
+            <w:tcW w:type="dxa" w:w="2448"/>
+          </w:tcPr>
+          <w:p>
+            <w:pPr>
+              <w:spacing w:after="0"/>
+            </w:pPr>
+            <w:r>
+              <w:rPr>
+                <w:sz w:val="16"/>
+              </w:rPr>
+            </w:r>
+            <w:r>
+              <w:rPr>
+                <w:rFonts w:ascii="Consolas" w:hAnsi="Consolas"/>
+                <w:sz w:val="16"/>
+              </w:rPr>
+              <w:t>ef926f4</w:t>
+            </w:r>
+          </w:p>
+        </w:tc>
+        <w:tc>
+          <w:tcPr>
+            <w:tcW w:type="dxa" w:w="2448"/>
+          </w:tcPr>
+          <w:p>
+            <w:pPr>
+              <w:spacing w:after="0"/>
+            </w:pPr>
+            <w:r>
+              <w:rPr>
+                <w:sz w:val="16"/>
+              </w:rPr>
+            </w:r>
+            <w:r>
+              <w:rPr>
+                <w:sz w:val="16"/>
+              </w:rPr>
+              <w:t>2026-09-28</w:t>
+            </w:r>
+          </w:p>
+        </w:tc>
+        <w:tc>
+          <w:tcPr>
+            <w:tcW w:type="dxa" w:w="2448"/>
+          </w:tcPr>
+          <w:p>
+            <w:pPr>
+              <w:spacing w:after="0"/>
+            </w:pPr>
+            <w:r>
+              <w:rPr>
+                <w:sz w:val="16"/>
+              </w:rPr>
+            </w:r>
+            <w:r>
+              <w:rPr>
+                <w:sz w:val="16"/>
+              </w:rPr>
+              <w:t>material completeness index - every project item mapped to the bundle or its reason</w:t>
             </w:r>
           </w:p>
         </w:tc>

</xml_diff>

<commit_message>
Round 20as: refresh the work log and package for the data-products round
</commit_message>
<xml_diff>
--- a/重构版论文_v4_20260915/工作日志_论文项目.docx
+++ b/重构版论文_v4_20260915/工作日志_论文项目.docx
@@ -19,7 +19,7 @@
         <w:t>生成时间</w:t>
       </w:r>
       <w:r>
-        <w:t xml:space="preserve">：2026-09-28 02:07（由 </w:t>
+        <w:t xml:space="preserve">：2026-09-28 02:26（由 </w:t>
       </w:r>
       <w:r>
         <w:rPr>
@@ -492,7 +492,7 @@
               <w:rPr>
                 <w:sz w:val="16"/>
               </w:rPr>
-              <w:t>，787 个条目</w:t>
+              <w:t>，789 个条目</w:t>
             </w:r>
           </w:p>
         </w:tc>
@@ -692,7 +692,7 @@
         <w:pStyle w:val="Heading2"/>
       </w:pPr>
       <w:r>
-        <w:t>2.2 仓库提交中的逐轮记录（91 条）</w:t>
+        <w:t>2.2 仓库提交中的逐轮记录（92 条）</w:t>
       </w:r>
     </w:p>
     <w:tbl>
@@ -8718,6 +8718,93 @@
                 <w:sz w:val="16"/>
               </w:rPr>
               <w:t>refresh the work log and package for the material-index round</w:t>
+            </w:r>
+          </w:p>
+        </w:tc>
+      </w:tr>
+      <w:tr>
+        <w:tc>
+          <w:tcPr>
+            <w:tcW w:type="dxa" w:w="2448"/>
+          </w:tcPr>
+          <w:p>
+            <w:pPr>
+              <w:spacing w:after="0"/>
+            </w:pPr>
+            <w:r>
+              <w:rPr>
+                <w:sz w:val="16"/>
+              </w:rPr>
+            </w:r>
+            <w:r>
+              <w:rPr>
+                <w:sz w:val="16"/>
+              </w:rPr>
+              <w:t>Round 20as</w:t>
+            </w:r>
+          </w:p>
+        </w:tc>
+        <w:tc>
+          <w:tcPr>
+            <w:tcW w:type="dxa" w:w="2448"/>
+          </w:tcPr>
+          <w:p>
+            <w:pPr>
+              <w:spacing w:after="0"/>
+            </w:pPr>
+            <w:r>
+              <w:rPr>
+                <w:sz w:val="16"/>
+              </w:rPr>
+            </w:r>
+            <w:r>
+              <w:rPr>
+                <w:rFonts w:ascii="Consolas" w:hAnsi="Consolas"/>
+                <w:sz w:val="16"/>
+              </w:rPr>
+              <w:t>197e990</w:t>
+            </w:r>
+          </w:p>
+        </w:tc>
+        <w:tc>
+          <w:tcPr>
+            <w:tcW w:type="dxa" w:w="2448"/>
+          </w:tcPr>
+          <w:p>
+            <w:pPr>
+              <w:spacing w:after="0"/>
+            </w:pPr>
+            <w:r>
+              <w:rPr>
+                <w:sz w:val="16"/>
+              </w:rPr>
+            </w:r>
+            <w:r>
+              <w:rPr>
+                <w:sz w:val="16"/>
+              </w:rPr>
+              <w:t>2026-09-28</w:t>
+            </w:r>
+          </w:p>
+        </w:tc>
+        <w:tc>
+          <w:tcPr>
+            <w:tcW w:type="dxa" w:w="2448"/>
+          </w:tcPr>
+          <w:p>
+            <w:pPr>
+              <w:spacing w:after="0"/>
+            </w:pPr>
+            <w:r>
+              <w:rPr>
+                <w:sz w:val="16"/>
+              </w:rPr>
+            </w:r>
+            <w:r>
+              <w:rPr>
+                <w:sz w:val="16"/>
+              </w:rPr>
+              <w:t>data-products inventory - row counts and hashes for every local dataset</w:t>
             </w:r>
           </w:p>
         </w:tc>

</xml_diff>

<commit_message>
Round 20at: refresh the work log and package for the structure round
</commit_message>
<xml_diff>
--- a/重构版论文_v4_20260915/工作日志_论文项目.docx
+++ b/重构版论文_v4_20260915/工作日志_论文项目.docx
@@ -19,7 +19,7 @@
         <w:t>生成时间</w:t>
       </w:r>
       <w:r>
-        <w:t xml:space="preserve">：2026-09-28 02:26（由 </w:t>
+        <w:t xml:space="preserve">：2026-09-28 03:03（由 </w:t>
       </w:r>
       <w:r>
         <w:rPr>
@@ -164,7 +164,7 @@
               <w:rPr>
                 <w:sz w:val="16"/>
               </w:rPr>
-              <w:t>英文 14,563 词 / 中文 39,816 字符；11 图、8 表</w:t>
+              <w:t>英文 14,820 词 / 中文 40,333 字符；11 图、8 表</w:t>
             </w:r>
           </w:p>
         </w:tc>
@@ -492,7 +492,7 @@
               <w:rPr>
                 <w:sz w:val="16"/>
               </w:rPr>
-              <w:t>，789 个条目</w:t>
+              <w:t>，790 个条目</w:t>
             </w:r>
           </w:p>
         </w:tc>
@@ -692,7 +692,7 @@
         <w:pStyle w:val="Heading2"/>
       </w:pPr>
       <w:r>
-        <w:t>2.2 仓库提交中的逐轮记录（92 条）</w:t>
+        <w:t>2.2 仓库提交中的逐轮记录（94 条）</w:t>
       </w:r>
     </w:p>
     <w:tbl>
@@ -8805,6 +8805,180 @@
                 <w:sz w:val="16"/>
               </w:rPr>
               <w:t>data-products inventory - row counts and hashes for every local dataset</w:t>
+            </w:r>
+          </w:p>
+        </w:tc>
+      </w:tr>
+      <w:tr>
+        <w:tc>
+          <w:tcPr>
+            <w:tcW w:type="dxa" w:w="2448"/>
+          </w:tcPr>
+          <w:p>
+            <w:pPr>
+              <w:spacing w:after="0"/>
+            </w:pPr>
+            <w:r>
+              <w:rPr>
+                <w:sz w:val="16"/>
+              </w:rPr>
+            </w:r>
+            <w:r>
+              <w:rPr>
+                <w:sz w:val="16"/>
+              </w:rPr>
+              <w:t>Round 20as</w:t>
+            </w:r>
+          </w:p>
+        </w:tc>
+        <w:tc>
+          <w:tcPr>
+            <w:tcW w:type="dxa" w:w="2448"/>
+          </w:tcPr>
+          <w:p>
+            <w:pPr>
+              <w:spacing w:after="0"/>
+            </w:pPr>
+            <w:r>
+              <w:rPr>
+                <w:sz w:val="16"/>
+              </w:rPr>
+            </w:r>
+            <w:r>
+              <w:rPr>
+                <w:rFonts w:ascii="Consolas" w:hAnsi="Consolas"/>
+                <w:sz w:val="16"/>
+              </w:rPr>
+              <w:t>3f1ab4b</w:t>
+            </w:r>
+          </w:p>
+        </w:tc>
+        <w:tc>
+          <w:tcPr>
+            <w:tcW w:type="dxa" w:w="2448"/>
+          </w:tcPr>
+          <w:p>
+            <w:pPr>
+              <w:spacing w:after="0"/>
+            </w:pPr>
+            <w:r>
+              <w:rPr>
+                <w:sz w:val="16"/>
+              </w:rPr>
+            </w:r>
+            <w:r>
+              <w:rPr>
+                <w:sz w:val="16"/>
+              </w:rPr>
+              <w:t>2026-09-28</w:t>
+            </w:r>
+          </w:p>
+        </w:tc>
+        <w:tc>
+          <w:tcPr>
+            <w:tcW w:type="dxa" w:w="2448"/>
+          </w:tcPr>
+          <w:p>
+            <w:pPr>
+              <w:spacing w:after="0"/>
+            </w:pPr>
+            <w:r>
+              <w:rPr>
+                <w:sz w:val="16"/>
+              </w:rPr>
+            </w:r>
+            <w:r>
+              <w:rPr>
+                <w:sz w:val="16"/>
+              </w:rPr>
+              <w:t>refresh the work log and package for the data-products round</w:t>
+            </w:r>
+          </w:p>
+        </w:tc>
+      </w:tr>
+      <w:tr>
+        <w:tc>
+          <w:tcPr>
+            <w:tcW w:type="dxa" w:w="2448"/>
+          </w:tcPr>
+          <w:p>
+            <w:pPr>
+              <w:spacing w:after="0"/>
+            </w:pPr>
+            <w:r>
+              <w:rPr>
+                <w:sz w:val="16"/>
+              </w:rPr>
+            </w:r>
+            <w:r>
+              <w:rPr>
+                <w:sz w:val="16"/>
+              </w:rPr>
+              <w:t>Round 20at</w:t>
+            </w:r>
+          </w:p>
+        </w:tc>
+        <w:tc>
+          <w:tcPr>
+            <w:tcW w:type="dxa" w:w="2448"/>
+          </w:tcPr>
+          <w:p>
+            <w:pPr>
+              <w:spacing w:after="0"/>
+            </w:pPr>
+            <w:r>
+              <w:rPr>
+                <w:sz w:val="16"/>
+              </w:rPr>
+            </w:r>
+            <w:r>
+              <w:rPr>
+                <w:rFonts w:ascii="Consolas" w:hAnsi="Consolas"/>
+                <w:sz w:val="16"/>
+              </w:rPr>
+              <w:t>4ea9a13</w:t>
+            </w:r>
+          </w:p>
+        </w:tc>
+        <w:tc>
+          <w:tcPr>
+            <w:tcW w:type="dxa" w:w="2448"/>
+          </w:tcPr>
+          <w:p>
+            <w:pPr>
+              <w:spacing w:after="0"/>
+            </w:pPr>
+            <w:r>
+              <w:rPr>
+                <w:sz w:val="16"/>
+              </w:rPr>
+            </w:r>
+            <w:r>
+              <w:rPr>
+                <w:sz w:val="16"/>
+              </w:rPr>
+              <w:t>2026-09-28</w:t>
+            </w:r>
+          </w:p>
+        </w:tc>
+        <w:tc>
+          <w:tcPr>
+            <w:tcW w:type="dxa" w:w="2448"/>
+          </w:tcPr>
+          <w:p>
+            <w:pPr>
+              <w:spacing w:after="0"/>
+            </w:pPr>
+            <w:r>
+              <w:rPr>
+                <w:sz w:val="16"/>
+              </w:rPr>
+            </w:r>
+            <w:r>
+              <w:rPr>
+                <w:sz w:val="16"/>
+              </w:rPr>
+              <w:t>structure pass - section roadmaps, H/RQ spine and a clearer conclusion</w:t>
             </w:r>
           </w:p>
         </w:tc>

</xml_diff>

<commit_message>
Round 20au: refresh the work log and package for the H2-control round
</commit_message>
<xml_diff>
--- a/重构版论文_v4_20260915/工作日志_论文项目.docx
+++ b/重构版论文_v4_20260915/工作日志_论文项目.docx
@@ -19,7 +19,7 @@
         <w:t>生成时间</w:t>
       </w:r>
       <w:r>
-        <w:t xml:space="preserve">：2026-09-28 03:03（由 </w:t>
+        <w:t xml:space="preserve">：2026-09-30 02:03（由 </w:t>
       </w:r>
       <w:r>
         <w:rPr>
@@ -164,7 +164,7 @@
               <w:rPr>
                 <w:sz w:val="16"/>
               </w:rPr>
-              <w:t>英文 14,820 词 / 中文 40,333 字符；11 图、8 表</w:t>
+              <w:t>英文 15,004 词 / 中文 40,769 字符；11 图、8 表</w:t>
             </w:r>
           </w:p>
         </w:tc>
@@ -492,7 +492,7 @@
               <w:rPr>
                 <w:sz w:val="16"/>
               </w:rPr>
-              <w:t>，790 个条目</w:t>
+              <w:t>，795 个条目</w:t>
             </w:r>
           </w:p>
         </w:tc>
@@ -692,7 +692,7 @@
         <w:pStyle w:val="Heading2"/>
       </w:pPr>
       <w:r>
-        <w:t>2.2 仓库提交中的逐轮记录（94 条）</w:t>
+        <w:t>2.2 仓库提交中的逐轮记录（96 条）</w:t>
       </w:r>
     </w:p>
     <w:tbl>
@@ -8979,6 +8979,180 @@
                 <w:sz w:val="16"/>
               </w:rPr>
               <w:t>structure pass - section roadmaps, H/RQ spine and a clearer conclusion</w:t>
+            </w:r>
+          </w:p>
+        </w:tc>
+      </w:tr>
+      <w:tr>
+        <w:tc>
+          <w:tcPr>
+            <w:tcW w:type="dxa" w:w="2448"/>
+          </w:tcPr>
+          <w:p>
+            <w:pPr>
+              <w:spacing w:after="0"/>
+            </w:pPr>
+            <w:r>
+              <w:rPr>
+                <w:sz w:val="16"/>
+              </w:rPr>
+            </w:r>
+            <w:r>
+              <w:rPr>
+                <w:sz w:val="16"/>
+              </w:rPr>
+              <w:t>Round 20at</w:t>
+            </w:r>
+          </w:p>
+        </w:tc>
+        <w:tc>
+          <w:tcPr>
+            <w:tcW w:type="dxa" w:w="2448"/>
+          </w:tcPr>
+          <w:p>
+            <w:pPr>
+              <w:spacing w:after="0"/>
+            </w:pPr>
+            <w:r>
+              <w:rPr>
+                <w:sz w:val="16"/>
+              </w:rPr>
+            </w:r>
+            <w:r>
+              <w:rPr>
+                <w:rFonts w:ascii="Consolas" w:hAnsi="Consolas"/>
+                <w:sz w:val="16"/>
+              </w:rPr>
+              <w:t>6850ad6</w:t>
+            </w:r>
+          </w:p>
+        </w:tc>
+        <w:tc>
+          <w:tcPr>
+            <w:tcW w:type="dxa" w:w="2448"/>
+          </w:tcPr>
+          <w:p>
+            <w:pPr>
+              <w:spacing w:after="0"/>
+            </w:pPr>
+            <w:r>
+              <w:rPr>
+                <w:sz w:val="16"/>
+              </w:rPr>
+            </w:r>
+            <w:r>
+              <w:rPr>
+                <w:sz w:val="16"/>
+              </w:rPr>
+              <w:t>2026-09-28</w:t>
+            </w:r>
+          </w:p>
+        </w:tc>
+        <w:tc>
+          <w:tcPr>
+            <w:tcW w:type="dxa" w:w="2448"/>
+          </w:tcPr>
+          <w:p>
+            <w:pPr>
+              <w:spacing w:after="0"/>
+            </w:pPr>
+            <w:r>
+              <w:rPr>
+                <w:sz w:val="16"/>
+              </w:rPr>
+            </w:r>
+            <w:r>
+              <w:rPr>
+                <w:sz w:val="16"/>
+              </w:rPr>
+              <w:t>refresh the work log and package for the structure round</w:t>
+            </w:r>
+          </w:p>
+        </w:tc>
+      </w:tr>
+      <w:tr>
+        <w:tc>
+          <w:tcPr>
+            <w:tcW w:type="dxa" w:w="2448"/>
+          </w:tcPr>
+          <w:p>
+            <w:pPr>
+              <w:spacing w:after="0"/>
+            </w:pPr>
+            <w:r>
+              <w:rPr>
+                <w:sz w:val="16"/>
+              </w:rPr>
+            </w:r>
+            <w:r>
+              <w:rPr>
+                <w:sz w:val="16"/>
+              </w:rPr>
+              <w:t>Round 20au</w:t>
+            </w:r>
+          </w:p>
+        </w:tc>
+        <w:tc>
+          <w:tcPr>
+            <w:tcW w:type="dxa" w:w="2448"/>
+          </w:tcPr>
+          <w:p>
+            <w:pPr>
+              <w:spacing w:after="0"/>
+            </w:pPr>
+            <w:r>
+              <w:rPr>
+                <w:sz w:val="16"/>
+              </w:rPr>
+            </w:r>
+            <w:r>
+              <w:rPr>
+                <w:rFonts w:ascii="Consolas" w:hAnsi="Consolas"/>
+                <w:sz w:val="16"/>
+              </w:rPr>
+              <w:t>d78383f</w:t>
+            </w:r>
+          </w:p>
+        </w:tc>
+        <w:tc>
+          <w:tcPr>
+            <w:tcW w:type="dxa" w:w="2448"/>
+          </w:tcPr>
+          <w:p>
+            <w:pPr>
+              <w:spacing w:after="0"/>
+            </w:pPr>
+            <w:r>
+              <w:rPr>
+                <w:sz w:val="16"/>
+              </w:rPr>
+            </w:r>
+            <w:r>
+              <w:rPr>
+                <w:sz w:val="16"/>
+              </w:rPr>
+              <w:t>2026-09-30</w:t>
+            </w:r>
+          </w:p>
+        </w:tc>
+        <w:tc>
+          <w:tcPr>
+            <w:tcW w:type="dxa" w:w="2448"/>
+          </w:tcPr>
+          <w:p>
+            <w:pPr>
+              <w:spacing w:after="0"/>
+            </w:pPr>
+            <w:r>
+              <w:rPr>
+                <w:sz w:val="16"/>
+              </w:rPr>
+            </w:r>
+            <w:r>
+              <w:rPr>
+                <w:sz w:val="16"/>
+              </w:rPr>
+              <w:t>same-members equal-weight control closes the H2 comparison gap</w:t>
             </w:r>
           </w:p>
         </w:tc>
@@ -9770,7 +9944,7 @@
           <w:rFonts w:ascii="Consolas" w:hAnsi="Consolas"/>
           <w:sz w:val="17"/>
         </w:rPr>
-        <w:t xml:space="preserve">  files carrying all ten seeds: 9; the three-seed set: 17</w:t>
+        <w:t xml:space="preserve">  files carrying all ten seeds: 11; the three-seed set: 17</w:t>
       </w:r>
     </w:p>
     <w:p>

</xml_diff>

<commit_message>
Round 20av: refresh the work log and package for the wording-repair round
</commit_message>
<xml_diff>
--- a/重构版论文_v4_20260915/工作日志_论文项目.docx
+++ b/重构版论文_v4_20260915/工作日志_论文项目.docx
@@ -19,7 +19,7 @@
         <w:t>生成时间</w:t>
       </w:r>
       <w:r>
-        <w:t xml:space="preserve">：2026-09-30 02:03（由 </w:t>
+        <w:t xml:space="preserve">：2026-10-01 00:14（由 </w:t>
       </w:r>
       <w:r>
         <w:rPr>
@@ -164,7 +164,7 @@
               <w:rPr>
                 <w:sz w:val="16"/>
               </w:rPr>
-              <w:t>英文 15,004 词 / 中文 40,769 字符；11 图、8 表</w:t>
+              <w:t>英文 15,101 词 / 中文 41,038 字符；11 图、8 表</w:t>
             </w:r>
           </w:p>
         </w:tc>
@@ -208,7 +208,7 @@
               <w:rPr>
                 <w:sz w:val="16"/>
               </w:rPr>
-              <w:t>英文 249 词（JISA 上限 250）</w:t>
+              <w:t>英文 247 词（JISA 上限 250）</w:t>
             </w:r>
           </w:p>
         </w:tc>
@@ -492,7 +492,7 @@
               <w:rPr>
                 <w:sz w:val="16"/>
               </w:rPr>
-              <w:t>，795 个条目</w:t>
+              <w:t>，796 个条目</w:t>
             </w:r>
           </w:p>
         </w:tc>
@@ -692,7 +692,7 @@
         <w:pStyle w:val="Heading2"/>
       </w:pPr>
       <w:r>
-        <w:t>2.2 仓库提交中的逐轮记录（96 条）</w:t>
+        <w:t>2.2 仓库提交中的逐轮记录（98 条）</w:t>
       </w:r>
     </w:p>
     <w:tbl>
@@ -9153,6 +9153,180 @@
                 <w:sz w:val="16"/>
               </w:rPr>
               <w:t>same-members equal-weight control closes the H2 comparison gap</w:t>
+            </w:r>
+          </w:p>
+        </w:tc>
+      </w:tr>
+      <w:tr>
+        <w:tc>
+          <w:tcPr>
+            <w:tcW w:type="dxa" w:w="2448"/>
+          </w:tcPr>
+          <w:p>
+            <w:pPr>
+              <w:spacing w:after="0"/>
+            </w:pPr>
+            <w:r>
+              <w:rPr>
+                <w:sz w:val="16"/>
+              </w:rPr>
+            </w:r>
+            <w:r>
+              <w:rPr>
+                <w:sz w:val="16"/>
+              </w:rPr>
+              <w:t>Round 20au</w:t>
+            </w:r>
+          </w:p>
+        </w:tc>
+        <w:tc>
+          <w:tcPr>
+            <w:tcW w:type="dxa" w:w="2448"/>
+          </w:tcPr>
+          <w:p>
+            <w:pPr>
+              <w:spacing w:after="0"/>
+            </w:pPr>
+            <w:r>
+              <w:rPr>
+                <w:sz w:val="16"/>
+              </w:rPr>
+            </w:r>
+            <w:r>
+              <w:rPr>
+                <w:rFonts w:ascii="Consolas" w:hAnsi="Consolas"/>
+                <w:sz w:val="16"/>
+              </w:rPr>
+              <w:t>36e95ab</w:t>
+            </w:r>
+          </w:p>
+        </w:tc>
+        <w:tc>
+          <w:tcPr>
+            <w:tcW w:type="dxa" w:w="2448"/>
+          </w:tcPr>
+          <w:p>
+            <w:pPr>
+              <w:spacing w:after="0"/>
+            </w:pPr>
+            <w:r>
+              <w:rPr>
+                <w:sz w:val="16"/>
+              </w:rPr>
+            </w:r>
+            <w:r>
+              <w:rPr>
+                <w:sz w:val="16"/>
+              </w:rPr>
+              <w:t>2026-09-30</w:t>
+            </w:r>
+          </w:p>
+        </w:tc>
+        <w:tc>
+          <w:tcPr>
+            <w:tcW w:type="dxa" w:w="2448"/>
+          </w:tcPr>
+          <w:p>
+            <w:pPr>
+              <w:spacing w:after="0"/>
+            </w:pPr>
+            <w:r>
+              <w:rPr>
+                <w:sz w:val="16"/>
+              </w:rPr>
+            </w:r>
+            <w:r>
+              <w:rPr>
+                <w:sz w:val="16"/>
+              </w:rPr>
+              <w:t>refresh the work log and package for the H2-control round</w:t>
+            </w:r>
+          </w:p>
+        </w:tc>
+      </w:tr>
+      <w:tr>
+        <w:tc>
+          <w:tcPr>
+            <w:tcW w:type="dxa" w:w="2448"/>
+          </w:tcPr>
+          <w:p>
+            <w:pPr>
+              <w:spacing w:after="0"/>
+            </w:pPr>
+            <w:r>
+              <w:rPr>
+                <w:sz w:val="16"/>
+              </w:rPr>
+            </w:r>
+            <w:r>
+              <w:rPr>
+                <w:sz w:val="16"/>
+              </w:rPr>
+              <w:t>Round 20av</w:t>
+            </w:r>
+          </w:p>
+        </w:tc>
+        <w:tc>
+          <w:tcPr>
+            <w:tcW w:type="dxa" w:w="2448"/>
+          </w:tcPr>
+          <w:p>
+            <w:pPr>
+              <w:spacing w:after="0"/>
+            </w:pPr>
+            <w:r>
+              <w:rPr>
+                <w:sz w:val="16"/>
+              </w:rPr>
+            </w:r>
+            <w:r>
+              <w:rPr>
+                <w:rFonts w:ascii="Consolas" w:hAnsi="Consolas"/>
+                <w:sz w:val="16"/>
+              </w:rPr>
+              <w:t>b1ef09e</w:t>
+            </w:r>
+          </w:p>
+        </w:tc>
+        <w:tc>
+          <w:tcPr>
+            <w:tcW w:type="dxa" w:w="2448"/>
+          </w:tcPr>
+          <w:p>
+            <w:pPr>
+              <w:spacing w:after="0"/>
+            </w:pPr>
+            <w:r>
+              <w:rPr>
+                <w:sz w:val="16"/>
+              </w:rPr>
+            </w:r>
+            <w:r>
+              <w:rPr>
+                <w:sz w:val="16"/>
+              </w:rPr>
+              <w:t>2026-10-01</w:t>
+            </w:r>
+          </w:p>
+        </w:tc>
+        <w:tc>
+          <w:tcPr>
+            <w:tcW w:type="dxa" w:w="2448"/>
+          </w:tcPr>
+          <w:p>
+            <w:pPr>
+              <w:spacing w:after="0"/>
+            </w:pPr>
+            <w:r>
+              <w:rPr>
+                <w:sz w:val="16"/>
+              </w:rPr>
+            </w:r>
+            <w:r>
+              <w:rPr>
+                <w:sz w:val="16"/>
+              </w:rPr>
+              <w:t>diversity claim stated as association; every cost figure carries its source</w:t>
             </w:r>
           </w:p>
         </w:tc>

</xml_diff>

<commit_message>
Round 20aw: refresh the work log and package for the new-experiments round
</commit_message>
<xml_diff>
--- a/重构版论文_v4_20260915/工作日志_论文项目.docx
+++ b/重构版论文_v4_20260915/工作日志_论文项目.docx
@@ -19,7 +19,7 @@
         <w:t>生成时间</w:t>
       </w:r>
       <w:r>
-        <w:t xml:space="preserve">：2026-10-01 00:14（由 </w:t>
+        <w:t xml:space="preserve">：2026-10-01 01:57（由 </w:t>
       </w:r>
       <w:r>
         <w:rPr>
@@ -164,7 +164,7 @@
               <w:rPr>
                 <w:sz w:val="16"/>
               </w:rPr>
-              <w:t>英文 15,101 词 / 中文 41,038 字符；11 图、8 表</w:t>
+              <w:t>英文 15,415 词 / 中文 41,712 字符；11 图、8 表</w:t>
             </w:r>
           </w:p>
         </w:tc>
@@ -492,7 +492,7 @@
               <w:rPr>
                 <w:sz w:val="16"/>
               </w:rPr>
-              <w:t>，796 个条目</w:t>
+              <w:t>，803 个条目</w:t>
             </w:r>
           </w:p>
         </w:tc>
@@ -692,7 +692,7 @@
         <w:pStyle w:val="Heading2"/>
       </w:pPr>
       <w:r>
-        <w:t>2.2 仓库提交中的逐轮记录（98 条）</w:t>
+        <w:t>2.2 仓库提交中的逐轮记录（100 条）</w:t>
       </w:r>
     </w:p>
     <w:tbl>
@@ -9327,6 +9327,180 @@
                 <w:sz w:val="16"/>
               </w:rPr>
               <w:t>diversity claim stated as association; every cost figure carries its source</w:t>
+            </w:r>
+          </w:p>
+        </w:tc>
+      </w:tr>
+      <w:tr>
+        <w:tc>
+          <w:tcPr>
+            <w:tcW w:type="dxa" w:w="2448"/>
+          </w:tcPr>
+          <w:p>
+            <w:pPr>
+              <w:spacing w:after="0"/>
+            </w:pPr>
+            <w:r>
+              <w:rPr>
+                <w:sz w:val="16"/>
+              </w:rPr>
+            </w:r>
+            <w:r>
+              <w:rPr>
+                <w:sz w:val="16"/>
+              </w:rPr>
+              <w:t>Round 20av</w:t>
+            </w:r>
+          </w:p>
+        </w:tc>
+        <w:tc>
+          <w:tcPr>
+            <w:tcW w:type="dxa" w:w="2448"/>
+          </w:tcPr>
+          <w:p>
+            <w:pPr>
+              <w:spacing w:after="0"/>
+            </w:pPr>
+            <w:r>
+              <w:rPr>
+                <w:sz w:val="16"/>
+              </w:rPr>
+            </w:r>
+            <w:r>
+              <w:rPr>
+                <w:rFonts w:ascii="Consolas" w:hAnsi="Consolas"/>
+                <w:sz w:val="16"/>
+              </w:rPr>
+              <w:t>9199eac</w:t>
+            </w:r>
+          </w:p>
+        </w:tc>
+        <w:tc>
+          <w:tcPr>
+            <w:tcW w:type="dxa" w:w="2448"/>
+          </w:tcPr>
+          <w:p>
+            <w:pPr>
+              <w:spacing w:after="0"/>
+            </w:pPr>
+            <w:r>
+              <w:rPr>
+                <w:sz w:val="16"/>
+              </w:rPr>
+            </w:r>
+            <w:r>
+              <w:rPr>
+                <w:sz w:val="16"/>
+              </w:rPr>
+              <w:t>2026-10-01</w:t>
+            </w:r>
+          </w:p>
+        </w:tc>
+        <w:tc>
+          <w:tcPr>
+            <w:tcW w:type="dxa" w:w="2448"/>
+          </w:tcPr>
+          <w:p>
+            <w:pPr>
+              <w:spacing w:after="0"/>
+            </w:pPr>
+            <w:r>
+              <w:rPr>
+                <w:sz w:val="16"/>
+              </w:rPr>
+            </w:r>
+            <w:r>
+              <w:rPr>
+                <w:sz w:val="16"/>
+              </w:rPr>
+              <w:t>refresh the work log and package for the wording-repair round</w:t>
+            </w:r>
+          </w:p>
+        </w:tc>
+      </w:tr>
+      <w:tr>
+        <w:tc>
+          <w:tcPr>
+            <w:tcW w:type="dxa" w:w="2448"/>
+          </w:tcPr>
+          <w:p>
+            <w:pPr>
+              <w:spacing w:after="0"/>
+            </w:pPr>
+            <w:r>
+              <w:rPr>
+                <w:sz w:val="16"/>
+              </w:rPr>
+            </w:r>
+            <w:r>
+              <w:rPr>
+                <w:sz w:val="16"/>
+              </w:rPr>
+              <w:t>Round 20aw</w:t>
+            </w:r>
+          </w:p>
+        </w:tc>
+        <w:tc>
+          <w:tcPr>
+            <w:tcW w:type="dxa" w:w="2448"/>
+          </w:tcPr>
+          <w:p>
+            <w:pPr>
+              <w:spacing w:after="0"/>
+            </w:pPr>
+            <w:r>
+              <w:rPr>
+                <w:sz w:val="16"/>
+              </w:rPr>
+            </w:r>
+            <w:r>
+              <w:rPr>
+                <w:rFonts w:ascii="Consolas" w:hAnsi="Consolas"/>
+                <w:sz w:val="16"/>
+              </w:rPr>
+              <w:t>a350620</w:t>
+            </w:r>
+          </w:p>
+        </w:tc>
+        <w:tc>
+          <w:tcPr>
+            <w:tcW w:type="dxa" w:w="2448"/>
+          </w:tcPr>
+          <w:p>
+            <w:pPr>
+              <w:spacing w:after="0"/>
+            </w:pPr>
+            <w:r>
+              <w:rPr>
+                <w:sz w:val="16"/>
+              </w:rPr>
+            </w:r>
+            <w:r>
+              <w:rPr>
+                <w:sz w:val="16"/>
+              </w:rPr>
+              <w:t>2026-10-01</w:t>
+            </w:r>
+          </w:p>
+        </w:tc>
+        <w:tc>
+          <w:tcPr>
+            <w:tcW w:type="dxa" w:w="2448"/>
+          </w:tcPr>
+          <w:p>
+            <w:pPr>
+              <w:spacing w:after="0"/>
+            </w:pPr>
+            <w:r>
+              <w:rPr>
+                <w:sz w:val="16"/>
+              </w:rPr>
+            </w:r>
+            <w:r>
+              <w:rPr>
+                <w:sz w:val="16"/>
+              </w:rPr>
+              <w:t>three new experiments - gate capacity, feature-budget sweep, ten-seed balanced control</w:t>
             </w:r>
           </w:p>
         </w:tc>
@@ -10118,7 +10292,7 @@
           <w:rFonts w:ascii="Consolas" w:hAnsi="Consolas"/>
           <w:sz w:val="17"/>
         </w:rPr>
-        <w:t xml:space="preserve">  files carrying all ten seeds: 11; the three-seed set: 17</w:t>
+        <w:t xml:space="preserve">  files carrying all ten seeds: 14; the three-seed set: 21</w:t>
       </w:r>
     </w:p>
     <w:p>
@@ -10154,7 +10328,7 @@
           <w:rFonts w:ascii="Consolas" w:hAnsi="Consolas"/>
           <w:sz w:val="17"/>
         </w:rPr>
-        <w:t xml:space="preserve">  16 released populations checked; every sampled prediction file covers its declared test set</w:t>
+        <w:t xml:space="preserve">  17 released populations checked; every sampled prediction file covers its declared test set</w:t>
       </w:r>
     </w:p>
     <w:p>

</xml_diff>

<commit_message>
Round 20ax: refresh the work log and package for the data-check round
</commit_message>
<xml_diff>
--- a/重构版论文_v4_20260915/工作日志_论文项目.docx
+++ b/重构版论文_v4_20260915/工作日志_论文项目.docx
@@ -19,7 +19,7 @@
         <w:t>生成时间</w:t>
       </w:r>
       <w:r>
-        <w:t xml:space="preserve">：2026-10-01 01:57（由 </w:t>
+        <w:t xml:space="preserve">：2026-10-01 02:31（由 </w:t>
       </w:r>
       <w:r>
         <w:rPr>
@@ -164,7 +164,7 @@
               <w:rPr>
                 <w:sz w:val="16"/>
               </w:rPr>
-              <w:t>英文 15,415 词 / 中文 41,712 字符；11 图、8 表</w:t>
+              <w:t>英文 15,512 词 / 中文 41,959 字符；11 图、8 表</w:t>
             </w:r>
           </w:p>
         </w:tc>
@@ -208,7 +208,7 @@
               <w:rPr>
                 <w:sz w:val="16"/>
               </w:rPr>
-              <w:t>英文 247 词（JISA 上限 250）</w:t>
+              <w:t>英文 248 词（JISA 上限 250）</w:t>
             </w:r>
           </w:p>
         </w:tc>
@@ -492,7 +492,7 @@
               <w:rPr>
                 <w:sz w:val="16"/>
               </w:rPr>
-              <w:t>，803 个条目</w:t>
+              <w:t>，807 个条目</w:t>
             </w:r>
           </w:p>
         </w:tc>
@@ -692,7 +692,7 @@
         <w:pStyle w:val="Heading2"/>
       </w:pPr>
       <w:r>
-        <w:t>2.2 仓库提交中的逐轮记录（100 条）</w:t>
+        <w:t>2.2 仓库提交中的逐轮记录（102 条）</w:t>
       </w:r>
     </w:p>
     <w:tbl>
@@ -9501,6 +9501,180 @@
                 <w:sz w:val="16"/>
               </w:rPr>
               <w:t>three new experiments - gate capacity, feature-budget sweep, ten-seed balanced control</w:t>
+            </w:r>
+          </w:p>
+        </w:tc>
+      </w:tr>
+      <w:tr>
+        <w:tc>
+          <w:tcPr>
+            <w:tcW w:type="dxa" w:w="2448"/>
+          </w:tcPr>
+          <w:p>
+            <w:pPr>
+              <w:spacing w:after="0"/>
+            </w:pPr>
+            <w:r>
+              <w:rPr>
+                <w:sz w:val="16"/>
+              </w:rPr>
+            </w:r>
+            <w:r>
+              <w:rPr>
+                <w:sz w:val="16"/>
+              </w:rPr>
+              <w:t>Round 20aw</w:t>
+            </w:r>
+          </w:p>
+        </w:tc>
+        <w:tc>
+          <w:tcPr>
+            <w:tcW w:type="dxa" w:w="2448"/>
+          </w:tcPr>
+          <w:p>
+            <w:pPr>
+              <w:spacing w:after="0"/>
+            </w:pPr>
+            <w:r>
+              <w:rPr>
+                <w:sz w:val="16"/>
+              </w:rPr>
+            </w:r>
+            <w:r>
+              <w:rPr>
+                <w:rFonts w:ascii="Consolas" w:hAnsi="Consolas"/>
+                <w:sz w:val="16"/>
+              </w:rPr>
+              <w:t>5dae840</w:t>
+            </w:r>
+          </w:p>
+        </w:tc>
+        <w:tc>
+          <w:tcPr>
+            <w:tcW w:type="dxa" w:w="2448"/>
+          </w:tcPr>
+          <w:p>
+            <w:pPr>
+              <w:spacing w:after="0"/>
+            </w:pPr>
+            <w:r>
+              <w:rPr>
+                <w:sz w:val="16"/>
+              </w:rPr>
+            </w:r>
+            <w:r>
+              <w:rPr>
+                <w:sz w:val="16"/>
+              </w:rPr>
+              <w:t>2026-10-01</w:t>
+            </w:r>
+          </w:p>
+        </w:tc>
+        <w:tc>
+          <w:tcPr>
+            <w:tcW w:type="dxa" w:w="2448"/>
+          </w:tcPr>
+          <w:p>
+            <w:pPr>
+              <w:spacing w:after="0"/>
+            </w:pPr>
+            <w:r>
+              <w:rPr>
+                <w:sz w:val="16"/>
+              </w:rPr>
+            </w:r>
+            <w:r>
+              <w:rPr>
+                <w:sz w:val="16"/>
+              </w:rPr>
+              <w:t>refresh the work log and package for the new-experiments round</w:t>
+            </w:r>
+          </w:p>
+        </w:tc>
+      </w:tr>
+      <w:tr>
+        <w:tc>
+          <w:tcPr>
+            <w:tcW w:type="dxa" w:w="2448"/>
+          </w:tcPr>
+          <w:p>
+            <w:pPr>
+              <w:spacing w:after="0"/>
+            </w:pPr>
+            <w:r>
+              <w:rPr>
+                <w:sz w:val="16"/>
+              </w:rPr>
+            </w:r>
+            <w:r>
+              <w:rPr>
+                <w:sz w:val="16"/>
+              </w:rPr>
+              <w:t>Round 20ax</w:t>
+            </w:r>
+          </w:p>
+        </w:tc>
+        <w:tc>
+          <w:tcPr>
+            <w:tcW w:type="dxa" w:w="2448"/>
+          </w:tcPr>
+          <w:p>
+            <w:pPr>
+              <w:spacing w:after="0"/>
+            </w:pPr>
+            <w:r>
+              <w:rPr>
+                <w:sz w:val="16"/>
+              </w:rPr>
+            </w:r>
+            <w:r>
+              <w:rPr>
+                <w:rFonts w:ascii="Consolas" w:hAnsi="Consolas"/>
+                <w:sz w:val="16"/>
+              </w:rPr>
+              <w:t>592f077</w:t>
+            </w:r>
+          </w:p>
+        </w:tc>
+        <w:tc>
+          <w:tcPr>
+            <w:tcW w:type="dxa" w:w="2448"/>
+          </w:tcPr>
+          <w:p>
+            <w:pPr>
+              <w:spacing w:after="0"/>
+            </w:pPr>
+            <w:r>
+              <w:rPr>
+                <w:sz w:val="16"/>
+              </w:rPr>
+            </w:r>
+            <w:r>
+              <w:rPr>
+                <w:sz w:val="16"/>
+              </w:rPr>
+              <w:t>2026-10-01</w:t>
+            </w:r>
+          </w:p>
+        </w:tc>
+        <w:tc>
+          <w:tcPr>
+            <w:tcW w:type="dxa" w:w="2448"/>
+          </w:tcPr>
+          <w:p>
+            <w:pPr>
+              <w:spacing w:after="0"/>
+            </w:pPr>
+            <w:r>
+              <w:rPr>
+                <w:sz w:val="16"/>
+              </w:rPr>
+            </w:r>
+            <w:r>
+              <w:rPr>
+                <w:sz w:val="16"/>
+              </w:rPr>
+              <w:t>measure expert disagreement - the never-disagree claim was wrong</w:t>
             </w:r>
           </w:p>
         </w:tc>

</xml_diff>

<commit_message>
Round 20ay: refresh the work log and package for the extension-experiment round
</commit_message>
<xml_diff>
--- a/重构版论文_v4_20260915/工作日志_论文项目.docx
+++ b/重构版论文_v4_20260915/工作日志_论文项目.docx
@@ -19,7 +19,7 @@
         <w:t>生成时间</w:t>
       </w:r>
       <w:r>
-        <w:t xml:space="preserve">：2026-10-01 14:43（由 </w:t>
+        <w:t xml:space="preserve">：2026-10-01 15:27（由 </w:t>
       </w:r>
       <w:r>
         <w:rPr>
@@ -164,7 +164,7 @@
               <w:rPr>
                 <w:sz w:val="16"/>
               </w:rPr>
-              <w:t>英文 15,936 词 / 中文 43,018 字符；11 图、8 表</w:t>
+              <w:t>英文 15,920 词 / 中文 43,018 字符；11 图、8 表</w:t>
             </w:r>
           </w:p>
         </w:tc>
@@ -492,7 +492,7 @@
               <w:rPr>
                 <w:sz w:val="16"/>
               </w:rPr>
-              <w:t>，831 个条目</w:t>
+              <w:t>，844 个条目</w:t>
             </w:r>
           </w:p>
         </w:tc>
@@ -692,7 +692,7 @@
         <w:pStyle w:val="Heading2"/>
       </w:pPr>
       <w:r>
-        <w:t>2.2 仓库提交中的逐轮记录（103 条）</w:t>
+        <w:t>2.2 仓库提交中的逐轮记录（104 条）</w:t>
       </w:r>
     </w:p>
     <w:tbl>
@@ -9762,6 +9762,93 @@
                 <w:sz w:val="16"/>
               </w:rPr>
               <w:t>refresh the work log and package for the data-check round</w:t>
+            </w:r>
+          </w:p>
+        </w:tc>
+      </w:tr>
+      <w:tr>
+        <w:tc>
+          <w:tcPr>
+            <w:tcW w:type="dxa" w:w="2448"/>
+          </w:tcPr>
+          <w:p>
+            <w:pPr>
+              <w:spacing w:after="0"/>
+            </w:pPr>
+            <w:r>
+              <w:rPr>
+                <w:sz w:val="16"/>
+              </w:rPr>
+            </w:r>
+            <w:r>
+              <w:rPr>
+                <w:sz w:val="16"/>
+              </w:rPr>
+              <w:t>Round 20ay</w:t>
+            </w:r>
+          </w:p>
+        </w:tc>
+        <w:tc>
+          <w:tcPr>
+            <w:tcW w:type="dxa" w:w="2448"/>
+          </w:tcPr>
+          <w:p>
+            <w:pPr>
+              <w:spacing w:after="0"/>
+            </w:pPr>
+            <w:r>
+              <w:rPr>
+                <w:sz w:val="16"/>
+              </w:rPr>
+            </w:r>
+            <w:r>
+              <w:rPr>
+                <w:rFonts w:ascii="Consolas" w:hAnsi="Consolas"/>
+                <w:sz w:val="16"/>
+              </w:rPr>
+              <w:t>ac996f1</w:t>
+            </w:r>
+          </w:p>
+        </w:tc>
+        <w:tc>
+          <w:tcPr>
+            <w:tcW w:type="dxa" w:w="2448"/>
+          </w:tcPr>
+          <w:p>
+            <w:pPr>
+              <w:spacing w:after="0"/>
+            </w:pPr>
+            <w:r>
+              <w:rPr>
+                <w:sz w:val="16"/>
+              </w:rPr>
+            </w:r>
+            <w:r>
+              <w:rPr>
+                <w:sz w:val="16"/>
+              </w:rPr>
+              <w:t>2026-10-01</w:t>
+            </w:r>
+          </w:p>
+        </w:tc>
+        <w:tc>
+          <w:tcPr>
+            <w:tcW w:type="dxa" w:w="2448"/>
+          </w:tcPr>
+          <w:p>
+            <w:pPr>
+              <w:spacing w:after="0"/>
+            </w:pPr>
+            <w:r>
+              <w:rPr>
+                <w:sz w:val="16"/>
+              </w:rPr>
+            </w:r>
+            <w:r>
+              <w:rPr>
+                <w:sz w:val="16"/>
+              </w:rPr>
+              <w:t>six extension experiments - member families, day holdout, 10-seed external benchmarks, deployment metrics, CIC-IDS2018 and CIC-IoT-2023</w:t>
             </w:r>
           </w:p>
         </w:tc>
@@ -10590,66 +10677,6 @@
           <w:sz w:val="17"/>
         </w:rPr>
         <w:t>== per-row prediction coverage ==</w:t>
-      </w:r>
-    </w:p>
-    <w:p>
-      <w:pPr>
-        <w:spacing w:after="0" w:line="240" w:lineRule="auto"/>
-      </w:pPr>
-      <w:r>
-        <w:rPr>
-          <w:rFonts w:ascii="Consolas" w:hAnsi="Consolas"/>
-          <w:sz w:val="17"/>
-        </w:rPr>
-        <w:t xml:space="preserve">  FAIL results_rccf_cic_ids2018_v1: 12,012 vs 5</w:t>
-      </w:r>
-    </w:p>
-    <w:p>
-      <w:pPr>
-        <w:spacing w:after="0" w:line="240" w:lineRule="auto"/>
-      </w:pPr>
-      <w:r>
-        <w:rPr>
-          <w:rFonts w:ascii="Consolas" w:hAnsi="Consolas"/>
-          <w:sz w:val="17"/>
-        </w:rPr>
-        <w:t xml:space="preserve">  FAIL results_rccf_cic_iot2023_v1: 37,516 vs 3</w:t>
-      </w:r>
-    </w:p>
-    <w:p>
-      <w:pPr>
-        <w:spacing w:after="0" w:line="240" w:lineRule="auto"/>
-      </w:pPr>
-      <w:r>
-        <w:rPr>
-          <w:rFonts w:ascii="Consolas" w:hAnsi="Consolas"/>
-          <w:sz w:val="17"/>
-        </w:rPr>
-        <w:t xml:space="preserve">  FAIL results_rccf_nbaiot_v10: 27,000 vs 10</w:t>
-      </w:r>
-    </w:p>
-    <w:p>
-      <w:pPr>
-        <w:spacing w:after="0" w:line="240" w:lineRule="auto"/>
-      </w:pPr>
-      <w:r>
-        <w:rPr>
-          <w:rFonts w:ascii="Consolas" w:hAnsi="Consolas"/>
-          <w:sz w:val="17"/>
-        </w:rPr>
-        <w:t xml:space="preserve">  FAIL results_rccf_nsl_v10: 22,544 vs 10</w:t>
-      </w:r>
-    </w:p>
-    <w:p>
-      <w:pPr>
-        <w:spacing w:after="0" w:line="240" w:lineRule="auto"/>
-      </w:pPr>
-      <w:r>
-        <w:rPr>
-          <w:rFonts w:ascii="Consolas" w:hAnsi="Consolas"/>
-          <w:sz w:val="17"/>
-        </w:rPr>
-        <w:t xml:space="preserve">  FAIL results_rccf_unsw_v10: 82,332 vs 10</w:t>
       </w:r>
     </w:p>
     <w:p>

</xml_diff>

<commit_message>
Round 20az: refresh the work log and package for the recent-corpora round
</commit_message>
<xml_diff>
--- a/重构版论文_v4_20260915/工作日志_论文项目.docx
+++ b/重构版论文_v4_20260915/工作日志_论文项目.docx
@@ -19,7 +19,7 @@
         <w:t>生成时间</w:t>
       </w:r>
       <w:r>
-        <w:t xml:space="preserve">：2026-10-01 17:48（由 </w:t>
+        <w:t xml:space="preserve">：2026-10-01 18:29（由 </w:t>
       </w:r>
       <w:r>
         <w:rPr>
@@ -492,7 +492,7 @@
               <w:rPr>
                 <w:sz w:val="16"/>
               </w:rPr>
-              <w:t>，856 个条目</w:t>
+              <w:t>，860 个条目</w:t>
             </w:r>
           </w:p>
         </w:tc>
@@ -692,7 +692,7 @@
         <w:pStyle w:val="Heading2"/>
       </w:pPr>
       <w:r>
-        <w:t>2.2 仓库提交中的逐轮记录（105 条）</w:t>
+        <w:t>2.2 仓库提交中的逐轮记录（106 条）</w:t>
       </w:r>
     </w:p>
     <w:tbl>
@@ -9936,6 +9936,93 @@
                 <w:sz w:val="16"/>
               </w:rPr>
               <w:t>refresh the work log and package for the extension-experiment round</w:t>
+            </w:r>
+          </w:p>
+        </w:tc>
+      </w:tr>
+      <w:tr>
+        <w:tc>
+          <w:tcPr>
+            <w:tcW w:type="dxa" w:w="2448"/>
+          </w:tcPr>
+          <w:p>
+            <w:pPr>
+              <w:spacing w:after="0"/>
+            </w:pPr>
+            <w:r>
+              <w:rPr>
+                <w:sz w:val="16"/>
+              </w:rPr>
+            </w:r>
+            <w:r>
+              <w:rPr>
+                <w:sz w:val="16"/>
+              </w:rPr>
+              <w:t>Round 20az</w:t>
+            </w:r>
+          </w:p>
+        </w:tc>
+        <w:tc>
+          <w:tcPr>
+            <w:tcW w:type="dxa" w:w="2448"/>
+          </w:tcPr>
+          <w:p>
+            <w:pPr>
+              <w:spacing w:after="0"/>
+            </w:pPr>
+            <w:r>
+              <w:rPr>
+                <w:sz w:val="16"/>
+              </w:rPr>
+            </w:r>
+            <w:r>
+              <w:rPr>
+                <w:rFonts w:ascii="Consolas" w:hAnsi="Consolas"/>
+                <w:sz w:val="16"/>
+              </w:rPr>
+              <w:t>7cd1862</w:t>
+            </w:r>
+          </w:p>
+        </w:tc>
+        <w:tc>
+          <w:tcPr>
+            <w:tcW w:type="dxa" w:w="2448"/>
+          </w:tcPr>
+          <w:p>
+            <w:pPr>
+              <w:spacing w:after="0"/>
+            </w:pPr>
+            <w:r>
+              <w:rPr>
+                <w:sz w:val="16"/>
+              </w:rPr>
+            </w:r>
+            <w:r>
+              <w:rPr>
+                <w:sz w:val="16"/>
+              </w:rPr>
+              <w:t>2026-10-01</w:t>
+            </w:r>
+          </w:p>
+        </w:tc>
+        <w:tc>
+          <w:tcPr>
+            <w:tcW w:type="dxa" w:w="2448"/>
+          </w:tcPr>
+          <w:p>
+            <w:pPr>
+              <w:spacing w:after="0"/>
+            </w:pPr>
+            <w:r>
+              <w:rPr>
+                <w:sz w:val="16"/>
+              </w:rPr>
+            </w:r>
+            <w:r>
+              <w:rPr>
+                <w:sz w:val="16"/>
+              </w:rPr>
+              <w:t>four recent corpora (2020-2023) - LITNET-2020, IoT-23, RT-IoT2022, ACI-IoT-2023</w:t>
             </w:r>
           </w:p>
         </w:tc>
@@ -10764,54 +10851,6 @@
           <w:sz w:val="17"/>
         </w:rPr>
         <w:t>== per-row prediction coverage ==</w:t>
-      </w:r>
-    </w:p>
-    <w:p>
-      <w:pPr>
-        <w:spacing w:after="0" w:line="240" w:lineRule="auto"/>
-      </w:pPr>
-      <w:r>
-        <w:rPr>
-          <w:rFonts w:ascii="Consolas" w:hAnsi="Consolas"/>
-          <w:sz w:val="17"/>
-        </w:rPr>
-        <w:t xml:space="preserve">  FAIL results_rccf_aci_iot2023_v1: 19,404 vs 3</w:t>
-      </w:r>
-    </w:p>
-    <w:p>
-      <w:pPr>
-        <w:spacing w:after="0" w:line="240" w:lineRule="auto"/>
-      </w:pPr>
-      <w:r>
-        <w:rPr>
-          <w:rFonts w:ascii="Consolas" w:hAnsi="Consolas"/>
-          <w:sz w:val="17"/>
-        </w:rPr>
-        <w:t xml:space="preserve">  FAIL results_rccf_iot23_v1: 4,000 vs 3</w:t>
-      </w:r>
-    </w:p>
-    <w:p>
-      <w:pPr>
-        <w:spacing w:after="0" w:line="240" w:lineRule="auto"/>
-      </w:pPr>
-      <w:r>
-        <w:rPr>
-          <w:rFonts w:ascii="Consolas" w:hAnsi="Consolas"/>
-          <w:sz w:val="17"/>
-        </w:rPr>
-        <w:t xml:space="preserve">  FAIL results_rccf_litnet2020_v1: 9,522 vs 3</w:t>
-      </w:r>
-    </w:p>
-    <w:p>
-      <w:pPr>
-        <w:spacing w:after="0" w:line="240" w:lineRule="auto"/>
-      </w:pPr>
-      <w:r>
-        <w:rPr>
-          <w:rFonts w:ascii="Consolas" w:hAnsi="Consolas"/>
-          <w:sz w:val="17"/>
-        </w:rPr>
-        <w:t xml:space="preserve">  FAIL results_rccf_rt_iot2022_v1: 5,390 vs 3</w:t>
       </w:r>
     </w:p>
     <w:p>

</xml_diff>